<commit_message>
docs(lk05): add FILKOM and UB logos to cover page following LK-03 format
</commit_message>
<xml_diff>
--- a/Documentation/LK05/LK05-Muhammad Ghazy Humaidi-245150200111071.docx
+++ b/Documentation/LK05/LK05-Muhammad Ghazy Humaidi-245150200111071.docx
@@ -4,15 +4,49 @@
   <w:body>
     <w:p>
       <w:pPr>
-        <w:spacing w:after="480" w:line="276" w:lineRule="auto"/>
-        <w:jc w:val="both"/>
-      </w:pPr>
-    </w:p>
-    <w:p>
-      <w:pPr>
-        <w:spacing w:after="480" w:line="276" w:lineRule="auto"/>
-        <w:jc w:val="both"/>
-      </w:pPr>
+        <w:spacing w:after="280"/>
+        <w:jc w:val="center"/>
+      </w:pPr>
+      <w:r>
+        <w:rPr>
+          <w:noProof/>
+        </w:rPr>
+        <w:drawing>
+          <wp:inline distT="0" distB="0" distL="0" distR="0">
+            <wp:extent cx="2651760" cy="815926"/>
+            <wp:effectExtent l="0" t="0" r="0" b="0"/>
+            <wp:docPr id="1" name="Picture 1"/>
+            <wp:cNvGraphicFramePr>
+              <a:graphicFrameLocks xmlns:a="http://schemas.openxmlformats.org/drawingml/2006/main" noChangeAspect="1"/>
+            </wp:cNvGraphicFramePr>
+            <a:graphic xmlns:a="http://schemas.openxmlformats.org/drawingml/2006/main">
+              <a:graphicData uri="http://schemas.openxmlformats.org/drawingml/2006/picture">
+                <pic:pic xmlns:pic="http://schemas.openxmlformats.org/drawingml/2006/picture">
+                  <pic:nvPicPr>
+                    <pic:cNvPr id="0" name="logo-filkom.png"/>
+                    <pic:cNvPicPr/>
+                  </pic:nvPicPr>
+                  <pic:blipFill>
+                    <a:blip r:embed="rId7"/>
+                    <a:stretch>
+                      <a:fillRect/>
+                    </a:stretch>
+                  </pic:blipFill>
+                  <pic:spPr>
+                    <a:xfrm>
+                      <a:off x="0" y="0"/>
+                      <a:ext cx="2651760" cy="815926"/>
+                    </a:xfrm>
+                    <a:prstGeom prst="rect">
+                      <a:avLst/>
+                    </a:prstGeom>
+                  </pic:spPr>
+                </pic:pic>
+              </a:graphicData>
+            </a:graphic>
+          </wp:inline>
+        </w:drawing>
+      </w:r>
     </w:p>
     <w:p>
       <w:pPr>
@@ -61,7 +95,7 @@
     </w:p>
     <w:p>
       <w:pPr>
-        <w:spacing w:after="800" w:line="276" w:lineRule="auto"/>
+        <w:spacing w:after="520" w:line="276" w:lineRule="auto"/>
         <w:jc w:val="center"/>
       </w:pPr>
       <w:r>
@@ -76,12 +110,6 @@
     </w:p>
     <w:p>
       <w:pPr>
-        <w:spacing w:after="600" w:line="276" w:lineRule="auto"/>
-        <w:jc w:val="both"/>
-      </w:pPr>
-    </w:p>
-    <w:p>
-      <w:pPr>
         <w:spacing w:after="40" w:line="276" w:lineRule="auto"/>
         <w:jc w:val="center"/>
       </w:pPr>
@@ -97,7 +125,7 @@
     </w:p>
     <w:p>
       <w:pPr>
-        <w:spacing w:after="320" w:line="276" w:lineRule="auto"/>
+        <w:spacing w:after="280" w:line="276" w:lineRule="auto"/>
         <w:jc w:val="center"/>
       </w:pPr>
       <w:r>
@@ -121,21 +149,12 @@
           <w:color w:val="000000"/>
           <w:sz w:val="24"/>
         </w:rPr>
-        <w:t xml:space="preserve">Dosen </w:t>
+        <w:t>Dosen Pengampu:</w:t>
       </w:r>
-      <w:r>
-        <w:rPr>
-          <w:rFonts w:ascii="Times New Roman" w:hAnsi="Times New Roman"/>
-          <w:b/>
-          <w:color w:val="000000"/>
-          <w:sz w:val="24"/>
-        </w:rPr>
-        <w:t>Pengampu:</w:t>
-      </w:r>
-    </w:p>
-    <w:p>
-      <w:pPr>
-        <w:spacing w:after="700" w:line="276" w:lineRule="auto"/>
+    </w:p>
+    <w:p>
+      <w:pPr>
+        <w:spacing w:after="320" w:line="276" w:lineRule="auto"/>
         <w:jc w:val="center"/>
       </w:pPr>
       <w:r>
@@ -145,6 +164,52 @@
           <w:sz w:val="24"/>
         </w:rPr>
         <w:t>Rizal Setya Perdana, S.Kom., M.Kom., Ph.D.</w:t>
+      </w:r>
+    </w:p>
+    <w:p>
+      <w:pPr>
+        <w:spacing w:after="280"/>
+        <w:jc w:val="center"/>
+      </w:pPr>
+      <w:r>
+        <w:rPr>
+          <w:noProof/>
+        </w:rPr>
+        <w:drawing>
+          <wp:inline distT="0" distB="0" distL="0" distR="0">
+            <wp:extent cx="1828800" cy="1854025"/>
+            <wp:effectExtent l="0" t="0" r="0" b="0"/>
+            <wp:docPr id="2" name="Picture 2"/>
+            <wp:cNvGraphicFramePr>
+              <a:graphicFrameLocks xmlns:a="http://schemas.openxmlformats.org/drawingml/2006/main" noChangeAspect="1"/>
+            </wp:cNvGraphicFramePr>
+            <a:graphic xmlns:a="http://schemas.openxmlformats.org/drawingml/2006/main">
+              <a:graphicData uri="http://schemas.openxmlformats.org/drawingml/2006/picture">
+                <pic:pic xmlns:pic="http://schemas.openxmlformats.org/drawingml/2006/picture">
+                  <pic:nvPicPr>
+                    <pic:cNvPr id="0" name="logo-ub.png"/>
+                    <pic:cNvPicPr/>
+                  </pic:nvPicPr>
+                  <pic:blipFill>
+                    <a:blip r:embed="rId8"/>
+                    <a:stretch>
+                      <a:fillRect/>
+                    </a:stretch>
+                  </pic:blipFill>
+                  <pic:spPr>
+                    <a:xfrm>
+                      <a:off x="0" y="0"/>
+                      <a:ext cx="1828800" cy="1854025"/>
+                    </a:xfrm>
+                    <a:prstGeom prst="rect">
+                      <a:avLst/>
+                    </a:prstGeom>
+                  </pic:spPr>
+                </pic:pic>
+              </a:graphicData>
+            </a:graphic>
+          </wp:inline>
+        </w:drawing>
       </w:r>
     </w:p>
     <w:p>
@@ -179,7 +244,7 @@
     </w:p>
     <w:p>
       <w:pPr>
-        <w:spacing w:after="40" w:line="276" w:lineRule="auto"/>
+        <w:spacing w:after="200" w:line="276" w:lineRule="auto"/>
         <w:jc w:val="center"/>
       </w:pPr>
       <w:r>
@@ -329,15 +394,7 @@
                 <w:color w:val="000000"/>
                 <w:sz w:val="19"/>
               </w:rPr>
-              <w:t xml:space="preserve">Nama </w:t>
-            </w:r>
-            <w:r>
-              <w:rPr>
-                <w:rFonts w:ascii="Times New Roman" w:hAnsi="Times New Roman"/>
-                <w:color w:val="000000"/>
-                <w:sz w:val="19"/>
-              </w:rPr>
-              <w:t>Mahasiswa / NIM</w:t>
+              <w:t>Nama Mahasiswa / NIM</w:t>
             </w:r>
           </w:p>
         </w:tc>
@@ -698,7 +755,7 @@
         </w:rPr>
         <w:fldChar w:fldCharType="separate"/>
       </w:r>
-      <w:hyperlink w:anchor="_Toc242357315" w:history="1">
+      <w:hyperlink w:anchor="_Toc242357514" w:history="1">
         <w:r>
           <w:rPr>
             <w:rStyle w:val="Hyperlink"/>
@@ -727,7 +784,7 @@
             <w:noProof/>
             <w:webHidden/>
           </w:rPr>
-          <w:instrText xml:space="preserve"> PAGEREF _Toc242357315 \h </w:instrText>
+          <w:instrText xml:space="preserve"> PAGEREF _Toc242357514 \h </w:instrText>
         </w:r>
         <w:r>
           <w:rPr>
@@ -774,7 +831,7 @@
           <w14:ligatures w14:val="standardContextual"/>
         </w:rPr>
       </w:pPr>
-      <w:hyperlink w:anchor="_Toc242357316" w:history="1">
+      <w:hyperlink w:anchor="_Toc242357515" w:history="1">
         <w:r>
           <w:rPr>
             <w:rStyle w:val="Hyperlink"/>
@@ -803,7 +860,7 @@
             <w:noProof/>
             <w:webHidden/>
           </w:rPr>
-          <w:instrText xml:space="preserve"> PAGEREF _Toc242357316 \h </w:instrText>
+          <w:instrText xml:space="preserve"> PAGEREF _Toc242357515 \h </w:instrText>
         </w:r>
         <w:r>
           <w:rPr>
@@ -850,7 +907,7 @@
           <w14:ligatures w14:val="standardContextual"/>
         </w:rPr>
       </w:pPr>
-      <w:hyperlink w:anchor="_Toc242357317" w:history="1">
+      <w:hyperlink w:anchor="_Toc242357516" w:history="1">
         <w:r>
           <w:rPr>
             <w:rStyle w:val="Hyperlink"/>
@@ -879,7 +936,7 @@
             <w:noProof/>
             <w:webHidden/>
           </w:rPr>
-          <w:instrText xml:space="preserve"> PAGEREF _Toc242357317 \h </w:instrText>
+          <w:instrText xml:space="preserve"> PAGEREF _Toc242357516 \h </w:instrText>
         </w:r>
         <w:r>
           <w:rPr>
@@ -926,7 +983,7 @@
           <w14:ligatures w14:val="standardContextual"/>
         </w:rPr>
       </w:pPr>
-      <w:hyperlink w:anchor="_Toc242357318" w:history="1">
+      <w:hyperlink w:anchor="_Toc242357517" w:history="1">
         <w:r>
           <w:rPr>
             <w:rStyle w:val="Hyperlink"/>
@@ -955,7 +1012,7 @@
             <w:noProof/>
             <w:webHidden/>
           </w:rPr>
-          <w:instrText xml:space="preserve"> PAGEREF _Toc242357318 \h </w:instrText>
+          <w:instrText xml:space="preserve"> PAGEREF _Toc242357517 \h </w:instrText>
         </w:r>
         <w:r>
           <w:rPr>
@@ -1002,7 +1059,7 @@
           <w14:ligatures w14:val="standardContextual"/>
         </w:rPr>
       </w:pPr>
-      <w:hyperlink w:anchor="_Toc242357319" w:history="1">
+      <w:hyperlink w:anchor="_Toc242357518" w:history="1">
         <w:r>
           <w:rPr>
             <w:rStyle w:val="Hyperlink"/>
@@ -1031,7 +1088,7 @@
             <w:noProof/>
             <w:webHidden/>
           </w:rPr>
-          <w:instrText xml:space="preserve"> PAGEREF _Toc242357319 \h </w:instrText>
+          <w:instrText xml:space="preserve"> PAGEREF _Toc242357518 \h </w:instrText>
         </w:r>
         <w:r>
           <w:rPr>
@@ -1078,7 +1135,7 @@
           <w14:ligatures w14:val="standardContextual"/>
         </w:rPr>
       </w:pPr>
-      <w:hyperlink w:anchor="_Toc242357320" w:history="1">
+      <w:hyperlink w:anchor="_Toc242357519" w:history="1">
         <w:r>
           <w:rPr>
             <w:rStyle w:val="Hyperlink"/>
@@ -1107,7 +1164,7 @@
             <w:noProof/>
             <w:webHidden/>
           </w:rPr>
-          <w:instrText xml:space="preserve"> PAGEREF _Toc242357320 \h </w:instrText>
+          <w:instrText xml:space="preserve"> PAGEREF _Toc242357519 \h </w:instrText>
         </w:r>
         <w:r>
           <w:rPr>
@@ -1154,7 +1211,7 @@
           <w14:ligatures w14:val="standardContextual"/>
         </w:rPr>
       </w:pPr>
-      <w:hyperlink w:anchor="_Toc242357321" w:history="1">
+      <w:hyperlink w:anchor="_Toc242357520" w:history="1">
         <w:r>
           <w:rPr>
             <w:rStyle w:val="Hyperlink"/>
@@ -1183,7 +1240,7 @@
             <w:noProof/>
             <w:webHidden/>
           </w:rPr>
-          <w:instrText xml:space="preserve"> PAGEREF _Toc242357321 \h </w:instrText>
+          <w:instrText xml:space="preserve"> PAGEREF _Toc242357520 \h </w:instrText>
         </w:r>
         <w:r>
           <w:rPr>
@@ -1230,7 +1287,7 @@
           <w14:ligatures w14:val="standardContextual"/>
         </w:rPr>
       </w:pPr>
-      <w:hyperlink w:anchor="_Toc242357322" w:history="1">
+      <w:hyperlink w:anchor="_Toc242357521" w:history="1">
         <w:r>
           <w:rPr>
             <w:rStyle w:val="Hyperlink"/>
@@ -1259,7 +1316,7 @@
             <w:noProof/>
             <w:webHidden/>
           </w:rPr>
-          <w:instrText xml:space="preserve"> PAGEREF _Toc242357322 \h </w:instrText>
+          <w:instrText xml:space="preserve"> PAGEREF _Toc242357521 \h </w:instrText>
         </w:r>
         <w:r>
           <w:rPr>
@@ -1306,7 +1363,7 @@
           <w14:ligatures w14:val="standardContextual"/>
         </w:rPr>
       </w:pPr>
-      <w:hyperlink w:anchor="_Toc242357323" w:history="1">
+      <w:hyperlink w:anchor="_Toc242357522" w:history="1">
         <w:r>
           <w:rPr>
             <w:rStyle w:val="Hyperlink"/>
@@ -1335,7 +1392,7 @@
             <w:noProof/>
             <w:webHidden/>
           </w:rPr>
-          <w:instrText xml:space="preserve"> PAGEREF _Toc242357323 \h </w:instrText>
+          <w:instrText xml:space="preserve"> PAGEREF _Toc242357522 \h </w:instrText>
         </w:r>
         <w:r>
           <w:rPr>
@@ -1382,7 +1439,7 @@
           <w14:ligatures w14:val="standardContextual"/>
         </w:rPr>
       </w:pPr>
-      <w:hyperlink w:anchor="_Toc242357324" w:history="1">
+      <w:hyperlink w:anchor="_Toc242357523" w:history="1">
         <w:r>
           <w:rPr>
             <w:rStyle w:val="Hyperlink"/>
@@ -1411,7 +1468,7 @@
             <w:noProof/>
             <w:webHidden/>
           </w:rPr>
-          <w:instrText xml:space="preserve"> PAGEREF _Toc242357324 \h </w:instrText>
+          <w:instrText xml:space="preserve"> PAGEREF _Toc242357523 \h </w:instrText>
         </w:r>
         <w:r>
           <w:rPr>
@@ -1458,7 +1515,7 @@
           <w14:ligatures w14:val="standardContextual"/>
         </w:rPr>
       </w:pPr>
-      <w:hyperlink w:anchor="_Toc242357325" w:history="1">
+      <w:hyperlink w:anchor="_Toc242357524" w:history="1">
         <w:r>
           <w:rPr>
             <w:rStyle w:val="Hyperlink"/>
@@ -1487,7 +1544,7 @@
             <w:noProof/>
             <w:webHidden/>
           </w:rPr>
-          <w:instrText xml:space="preserve"> PAGEREF _Toc242357325 \h </w:instrText>
+          <w:instrText xml:space="preserve"> PAGEREF _Toc242357524 \h </w:instrText>
         </w:r>
         <w:r>
           <w:rPr>
@@ -1534,7 +1591,7 @@
           <w14:ligatures w14:val="standardContextual"/>
         </w:rPr>
       </w:pPr>
-      <w:hyperlink w:anchor="_Toc242357326" w:history="1">
+      <w:hyperlink w:anchor="_Toc242357525" w:history="1">
         <w:r>
           <w:rPr>
             <w:rStyle w:val="Hyperlink"/>
@@ -1563,7 +1620,7 @@
             <w:noProof/>
             <w:webHidden/>
           </w:rPr>
-          <w:instrText xml:space="preserve"> PAGEREF _Toc242357326 \h </w:instrText>
+          <w:instrText xml:space="preserve"> PAGEREF _Toc242357525 \h </w:instrText>
         </w:r>
         <w:r>
           <w:rPr>
@@ -1610,7 +1667,7 @@
           <w14:ligatures w14:val="standardContextual"/>
         </w:rPr>
       </w:pPr>
-      <w:hyperlink w:anchor="_Toc242357327" w:history="1">
+      <w:hyperlink w:anchor="_Toc242357526" w:history="1">
         <w:r>
           <w:rPr>
             <w:rStyle w:val="Hyperlink"/>
@@ -1639,7 +1696,7 @@
             <w:noProof/>
             <w:webHidden/>
           </w:rPr>
-          <w:instrText xml:space="preserve"> PAGEREF _Toc242357327 \h </w:instrText>
+          <w:instrText xml:space="preserve"> PAGEREF _Toc242357526 \h </w:instrText>
         </w:r>
         <w:r>
           <w:rPr>
@@ -1686,7 +1743,7 @@
           <w14:ligatures w14:val="standardContextual"/>
         </w:rPr>
       </w:pPr>
-      <w:hyperlink w:anchor="_Toc242357328" w:history="1">
+      <w:hyperlink w:anchor="_Toc242357527" w:history="1">
         <w:r>
           <w:rPr>
             <w:rStyle w:val="Hyperlink"/>
@@ -1715,7 +1772,7 @@
             <w:noProof/>
             <w:webHidden/>
           </w:rPr>
-          <w:instrText xml:space="preserve"> PAGEREF _Toc242357328 \h </w:instrText>
+          <w:instrText xml:space="preserve"> PAGEREF _Toc242357527 \h </w:instrText>
         </w:r>
         <w:r>
           <w:rPr>
@@ -1762,7 +1819,7 @@
           <w14:ligatures w14:val="standardContextual"/>
         </w:rPr>
       </w:pPr>
-      <w:hyperlink w:anchor="_Toc242357329" w:history="1">
+      <w:hyperlink w:anchor="_Toc242357528" w:history="1">
         <w:r>
           <w:rPr>
             <w:rStyle w:val="Hyperlink"/>
@@ -1791,7 +1848,7 @@
             <w:noProof/>
             <w:webHidden/>
           </w:rPr>
-          <w:instrText xml:space="preserve"> PAGEREF _Toc242357329 \h </w:instrText>
+          <w:instrText xml:space="preserve"> PAGEREF _Toc242357528 \h </w:instrText>
         </w:r>
         <w:r>
           <w:rPr>
@@ -1838,7 +1895,7 @@
           <w14:ligatures w14:val="standardContextual"/>
         </w:rPr>
       </w:pPr>
-      <w:hyperlink w:anchor="_Toc242357330" w:history="1">
+      <w:hyperlink w:anchor="_Toc242357529" w:history="1">
         <w:r>
           <w:rPr>
             <w:rStyle w:val="Hyperlink"/>
@@ -1867,7 +1924,7 @@
             <w:noProof/>
             <w:webHidden/>
           </w:rPr>
-          <w:instrText xml:space="preserve"> PAGEREF _Toc242357330 \h </w:instrText>
+          <w:instrText xml:space="preserve"> PAGEREF _Toc242357529 \h </w:instrText>
         </w:r>
         <w:r>
           <w:rPr>
@@ -1914,7 +1971,7 @@
           <w14:ligatures w14:val="standardContextual"/>
         </w:rPr>
       </w:pPr>
-      <w:hyperlink w:anchor="_Toc242357331" w:history="1">
+      <w:hyperlink w:anchor="_Toc242357530" w:history="1">
         <w:r>
           <w:rPr>
             <w:rStyle w:val="Hyperlink"/>
@@ -1943,7 +2000,7 @@
             <w:noProof/>
             <w:webHidden/>
           </w:rPr>
-          <w:instrText xml:space="preserve"> PAGEREF _Toc242357331 \h </w:instrText>
+          <w:instrText xml:space="preserve"> PAGEREF _Toc242357530 \h </w:instrText>
         </w:r>
         <w:r>
           <w:rPr>
@@ -1990,7 +2047,7 @@
           <w14:ligatures w14:val="standardContextual"/>
         </w:rPr>
       </w:pPr>
-      <w:hyperlink w:anchor="_Toc242357332" w:history="1">
+      <w:hyperlink w:anchor="_Toc242357531" w:history="1">
         <w:r>
           <w:rPr>
             <w:rStyle w:val="Hyperlink"/>
@@ -2019,7 +2076,7 @@
             <w:noProof/>
             <w:webHidden/>
           </w:rPr>
-          <w:instrText xml:space="preserve"> PAGEREF _Toc242357332 \h </w:instrText>
+          <w:instrText xml:space="preserve"> PAGEREF _Toc242357531 \h </w:instrText>
         </w:r>
         <w:r>
           <w:rPr>
@@ -2066,7 +2123,7 @@
           <w14:ligatures w14:val="standardContextual"/>
         </w:rPr>
       </w:pPr>
-      <w:hyperlink w:anchor="_Toc242357333" w:history="1">
+      <w:hyperlink w:anchor="_Toc242357532" w:history="1">
         <w:r>
           <w:rPr>
             <w:rStyle w:val="Hyperlink"/>
@@ -2095,7 +2152,7 @@
             <w:noProof/>
             <w:webHidden/>
           </w:rPr>
-          <w:instrText xml:space="preserve"> PAGEREF _Toc242357333 \h </w:instrText>
+          <w:instrText xml:space="preserve"> PAGEREF _Toc242357532 \h </w:instrText>
         </w:r>
         <w:r>
           <w:rPr>
@@ -2142,7 +2199,7 @@
           <w14:ligatures w14:val="standardContextual"/>
         </w:rPr>
       </w:pPr>
-      <w:hyperlink w:anchor="_Toc242357334" w:history="1">
+      <w:hyperlink w:anchor="_Toc242357533" w:history="1">
         <w:r>
           <w:rPr>
             <w:rStyle w:val="Hyperlink"/>
@@ -2171,7 +2228,7 @@
             <w:noProof/>
             <w:webHidden/>
           </w:rPr>
-          <w:instrText xml:space="preserve"> PAGEREF _Toc242357334 \h </w:instrText>
+          <w:instrText xml:space="preserve"> PAGEREF _Toc242357533 \h </w:instrText>
         </w:r>
         <w:r>
           <w:rPr>
@@ -2226,7 +2283,7 @@
         <w:spacing w:before="240" w:after="60"/>
         <w:outlineLvl w:val="0"/>
       </w:pPr>
-      <w:bookmarkStart w:id="0" w:name="_Toc242357315"/>
+      <w:bookmarkStart w:id="0" w:name="_Toc242357514"/>
       <w:r>
         <w:rPr>
           <w:rFonts w:ascii="Times New Roman" w:hAnsi="Times New Roman"/>
@@ -2245,7 +2302,7 @@
         <w:spacing w:before="200" w:after="40"/>
         <w:outlineLvl w:val="1"/>
       </w:pPr>
-      <w:bookmarkStart w:id="1" w:name="_Toc242357316"/>
+      <w:bookmarkStart w:id="1" w:name="_Toc242357515"/>
       <w:r>
         <w:rPr>
           <w:rFonts w:ascii="Times New Roman" w:hAnsi="Times New Roman"/>
@@ -2299,7 +2356,7 @@
         <w:spacing w:before="200" w:after="40"/>
         <w:outlineLvl w:val="1"/>
       </w:pPr>
-      <w:bookmarkStart w:id="2" w:name="_Toc242357317"/>
+      <w:bookmarkStart w:id="2" w:name="_Toc242357516"/>
       <w:r>
         <w:rPr>
           <w:rFonts w:ascii="Times New Roman" w:hAnsi="Times New Roman"/>
@@ -2771,7 +2828,7 @@
         <w:spacing w:before="240" w:after="60"/>
         <w:outlineLvl w:val="0"/>
       </w:pPr>
-      <w:bookmarkStart w:id="3" w:name="_Toc242357318"/>
+      <w:bookmarkStart w:id="3" w:name="_Toc242357517"/>
       <w:r>
         <w:rPr>
           <w:rFonts w:ascii="Times New Roman" w:hAnsi="Times New Roman"/>
@@ -2798,7 +2855,7 @@
         <w:spacing w:before="200" w:after="40"/>
         <w:outlineLvl w:val="1"/>
       </w:pPr>
-      <w:bookmarkStart w:id="4" w:name="_Toc242357319"/>
+      <w:bookmarkStart w:id="4" w:name="_Toc242357518"/>
       <w:r>
         <w:rPr>
           <w:rFonts w:ascii="Times New Roman" w:hAnsi="Times New Roman"/>
@@ -2821,7 +2878,15 @@
           <w:color w:val="000000"/>
           <w:sz w:val="24"/>
         </w:rPr>
-        <w:t>DVC dipasang dengan ekstensi SSH karena remote storage menggunakan protokol SSH, dan versinya dikunci pada requirements.txt agar lingkungan dapat direproduksi. Pekerjaan dilakukan pada branch terpisah sesuai GitHub Flow (feat/lk05-dvc-versioning).</w:t>
+        <w:t xml:space="preserve">DVC dipasang dengan ekstensi SSH karena remote storage menggunakan protokol SSH, dan versinya dikunci pada requirements.txt agar lingkungan dapat direproduksi. Pekerjaan dilakukan pada branch terpisah </w:t>
+      </w:r>
+      <w:r>
+        <w:rPr>
+          <w:rFonts w:ascii="Times New Roman" w:hAnsi="Times New Roman"/>
+          <w:color w:val="000000"/>
+          <w:sz w:val="24"/>
+        </w:rPr>
+        <w:t>sesuai GitHub Flow (feat/lk05-dvc-versioning).</w:t>
       </w:r>
     </w:p>
     <w:tbl>
@@ -2943,15 +3008,7 @@
           <w:color w:val="000000"/>
           <w:sz w:val="24"/>
         </w:rPr>
-        <w:t xml:space="preserve">Perintah dvc init </w:t>
-      </w:r>
-      <w:r>
-        <w:rPr>
-          <w:rFonts w:ascii="Times New Roman" w:hAnsi="Times New Roman"/>
-          <w:color w:val="000000"/>
-          <w:sz w:val="24"/>
-        </w:rPr>
-        <w:t>membentuk direktori .dvc/ (konfigurasi dan cache), berkas .dvc/.gitignore, serta .dvcignore. Berkas-berkas konfigurasi ini yang di-commit ke Git, sedangkan cache lokal tidak.</w:t>
+        <w:t>Perintah dvc init membentuk direktori .dvc/ (konfigurasi dan cache), berkas .dvc/.gitignore, serta .dvcignore. Berkas-berkas konfigurasi ini yang di-commit ke Git, sedangkan cache lokal tidak.</w:t>
       </w:r>
     </w:p>
     <w:p>
@@ -2960,7 +3017,7 @@
         <w:spacing w:before="200" w:after="40"/>
         <w:outlineLvl w:val="1"/>
       </w:pPr>
-      <w:bookmarkStart w:id="5" w:name="_Toc242357320"/>
+      <w:bookmarkStart w:id="5" w:name="_Toc242357519"/>
       <w:r>
         <w:rPr>
           <w:rFonts w:ascii="Times New Roman" w:hAnsi="Times New Roman"/>
@@ -3124,7 +3181,7 @@
         <w:spacing w:before="240" w:after="60"/>
         <w:outlineLvl w:val="0"/>
       </w:pPr>
-      <w:bookmarkStart w:id="6" w:name="_Toc242357321"/>
+      <w:bookmarkStart w:id="6" w:name="_Toc242357520"/>
       <w:r>
         <w:rPr>
           <w:rFonts w:ascii="Times New Roman" w:hAnsi="Times New Roman"/>
@@ -3142,7 +3199,7 @@
         <w:spacing w:before="200" w:after="40"/>
         <w:outlineLvl w:val="1"/>
       </w:pPr>
-      <w:bookmarkStart w:id="7" w:name="_Toc242357322"/>
+      <w:bookmarkStart w:id="7" w:name="_Toc242357521"/>
       <w:r>
         <w:rPr>
           <w:rFonts w:ascii="Times New Roman" w:hAnsi="Times New Roman"/>
@@ -3366,7 +3423,7 @@
         <w:spacing w:before="200" w:after="40"/>
         <w:outlineLvl w:val="1"/>
       </w:pPr>
-      <w:bookmarkStart w:id="8" w:name="_Toc242357323"/>
+      <w:bookmarkStart w:id="8" w:name="_Toc242357522"/>
       <w:r>
         <w:rPr>
           <w:rFonts w:ascii="Times New Roman" w:hAnsi="Times New Roman"/>
@@ -3503,7 +3560,7 @@
         <w:spacing w:before="200" w:after="40"/>
         <w:outlineLvl w:val="1"/>
       </w:pPr>
-      <w:bookmarkStart w:id="9" w:name="_Toc242357324"/>
+      <w:bookmarkStart w:id="9" w:name="_Toc242357523"/>
       <w:r>
         <w:rPr>
           <w:rFonts w:ascii="Times New Roman" w:hAnsi="Times New Roman"/>
@@ -4286,7 +4343,7 @@
         <w:spacing w:before="240" w:after="60"/>
         <w:outlineLvl w:val="0"/>
       </w:pPr>
-      <w:bookmarkStart w:id="10" w:name="_Toc242357325"/>
+      <w:bookmarkStart w:id="10" w:name="_Toc242357524"/>
       <w:r>
         <w:rPr>
           <w:rFonts w:ascii="Times New Roman" w:hAnsi="Times New Roman"/>
@@ -4304,7 +4361,7 @@
         <w:spacing w:before="200" w:after="40"/>
         <w:outlineLvl w:val="1"/>
       </w:pPr>
-      <w:bookmarkStart w:id="11" w:name="_Toc242357326"/>
+      <w:bookmarkStart w:id="11" w:name="_Toc242357525"/>
       <w:r>
         <w:rPr>
           <w:rFonts w:ascii="Times New Roman" w:hAnsi="Times New Roman"/>
@@ -4546,7 +4603,7 @@
         <w:spacing w:before="200" w:after="40"/>
         <w:outlineLvl w:val="1"/>
       </w:pPr>
-      <w:bookmarkStart w:id="12" w:name="_Toc242357327"/>
+      <w:bookmarkStart w:id="12" w:name="_Toc242357526"/>
       <w:r>
         <w:rPr>
           <w:rFonts w:ascii="Times New Roman" w:hAnsi="Times New Roman"/>
@@ -4730,7 +4787,7 @@
         <w:spacing w:before="200" w:after="40"/>
         <w:outlineLvl w:val="1"/>
       </w:pPr>
-      <w:bookmarkStart w:id="13" w:name="_Toc242357328"/>
+      <w:bookmarkStart w:id="13" w:name="_Toc242357527"/>
       <w:r>
         <w:rPr>
           <w:rFonts w:ascii="Times New Roman" w:hAnsi="Times New Roman"/>
@@ -5148,7 +5205,7 @@
         <w:spacing w:before="200" w:after="40"/>
         <w:outlineLvl w:val="1"/>
       </w:pPr>
-      <w:bookmarkStart w:id="14" w:name="_Toc242357329"/>
+      <w:bookmarkStart w:id="14" w:name="_Toc242357528"/>
       <w:r>
         <w:rPr>
           <w:rFonts w:ascii="Times New Roman" w:hAnsi="Times New Roman"/>
@@ -5420,7 +5477,7 @@
         <w:spacing w:before="240" w:after="60"/>
         <w:outlineLvl w:val="0"/>
       </w:pPr>
-      <w:bookmarkStart w:id="15" w:name="_Toc242357330"/>
+      <w:bookmarkStart w:id="15" w:name="_Toc242357529"/>
       <w:r>
         <w:rPr>
           <w:rFonts w:ascii="Times New Roman" w:hAnsi="Times New Roman"/>
@@ -5438,7 +5495,7 @@
         <w:spacing w:before="200" w:after="40"/>
         <w:outlineLvl w:val="1"/>
       </w:pPr>
-      <w:bookmarkStart w:id="16" w:name="_Toc242357331"/>
+      <w:bookmarkStart w:id="16" w:name="_Toc242357530"/>
       <w:r>
         <w:rPr>
           <w:rFonts w:ascii="Times New Roman" w:hAnsi="Times New Roman"/>
@@ -5492,7 +5549,7 @@
         <w:spacing w:before="200" w:after="40"/>
         <w:outlineLvl w:val="1"/>
       </w:pPr>
-      <w:bookmarkStart w:id="17" w:name="_Toc242357332"/>
+      <w:bookmarkStart w:id="17" w:name="_Toc242357531"/>
       <w:r>
         <w:rPr>
           <w:rFonts w:ascii="Times New Roman" w:hAnsi="Times New Roman"/>
@@ -5637,7 +5694,7 @@
         <w:spacing w:before="200" w:after="40"/>
         <w:outlineLvl w:val="1"/>
       </w:pPr>
-      <w:bookmarkStart w:id="18" w:name="_Toc242357333"/>
+      <w:bookmarkStart w:id="18" w:name="_Toc242357532"/>
       <w:r>
         <w:rPr>
           <w:rFonts w:ascii="Times New Roman" w:hAnsi="Times New Roman"/>
@@ -6275,7 +6332,7 @@
         <w:spacing w:before="240" w:after="60"/>
         <w:outlineLvl w:val="0"/>
       </w:pPr>
-      <w:bookmarkStart w:id="19" w:name="_Toc242357334"/>
+      <w:bookmarkStart w:id="19" w:name="_Toc242357533"/>
       <w:r>
         <w:rPr>
           <w:rFonts w:ascii="Times New Roman" w:hAnsi="Times New Roman"/>
@@ -6602,8 +6659,8 @@
       </w:pPr>
     </w:p>
     <w:sectPr>
-      <w:headerReference w:type="default" r:id="rId7"/>
-      <w:footerReference w:type="default" r:id="rId8"/>
+      <w:headerReference w:type="default" r:id="rId9"/>
+      <w:footerReference w:type="default" r:id="rId10"/>
       <w:pgSz w:w="11909" w:h="16834"/>
       <w:pgMar w:top="1300" w:right="1440" w:bottom="1300" w:left="1440" w:header="708" w:footer="708" w:gutter="0"/>
       <w:pgNumType w:start="1"/>
@@ -6802,9 +6859,9 @@
 <file path=word/numbering.xml><?xml version="1.0" encoding="utf-8"?>
 <w:numbering xmlns:wpc="http://schemas.microsoft.com/office/word/2010/wordprocessingCanvas" xmlns:cx="http://schemas.microsoft.com/office/drawing/2014/chartex" xmlns:cx1="http://schemas.microsoft.com/office/drawing/2015/9/8/chartex" xmlns:cx2="http://schemas.microsoft.com/office/drawing/2015/10/21/chartex" xmlns:cx3="http://schemas.microsoft.com/office/drawing/2016/5/9/chartex" xmlns:cx4="http://schemas.microsoft.com/office/drawing/2016/5/10/chartex" xmlns:cx5="http://schemas.microsoft.com/office/drawing/2016/5/11/chartex" xmlns:cx6="http://schemas.microsoft.com/office/drawing/2016/5/12/chartex" xmlns:cx7="http://schemas.microsoft.com/office/drawing/2016/5/13/chartex" xmlns:cx8="http://schemas.microsoft.com/office/drawing/2016/5/14/chartex" xmlns:mc="http://schemas.openxmlformats.org/markup-compatibility/2006" xmlns:aink="http://schemas.microsoft.com/office/drawing/2016/ink" xmlns:am3d="http://schemas.microsoft.com/office/drawing/2017/model3d" xmlns:o="urn:schemas-microsoft-com:office:office" xmlns:oel="http://schemas.microsoft.com/office/2019/extlst" xmlns:r="http://schemas.openxmlformats.org/officeDocument/2006/relationships" xmlns:m="http://schemas.openxmlformats.org/officeDocument/2006/math" xmlns:v="urn:schemas-microsoft-com:vml" xmlns:wp14="http://schemas.microsoft.com/office/word/2010/wordprocessingDrawing" xmlns:wp="http://schemas.openxmlformats.org/drawingml/2006/wordprocessingDrawing" xmlns:w10="urn:schemas-microsoft-com:office:word" xmlns:w="http://schemas.openxmlformats.org/wordprocessingml/2006/main" xmlns:w14="http://schemas.microsoft.com/office/word/2010/wordml" xmlns:w15="http://schemas.microsoft.com/office/word/2012/wordml" xmlns:w16cex="http://schemas.microsoft.com/office/word/2018/wordml/cex" xmlns:w16cid="http://schemas.microsoft.com/office/word/2016/wordml/cid" xmlns:w16="http://schemas.microsoft.com/office/word/2018/wordml" xmlns:w16du="http://schemas.microsoft.com/office/word/2023/wordml/word16du" xmlns:w16sdtdh="http://schemas.microsoft.com/office/word/2020/wordml/sdtdatahash" xmlns:w16se="http://schemas.microsoft.com/office/word/2015/wordml/symex" xmlns:wpg="http://schemas.microsoft.com/office/word/2010/wordprocessingGroup" xmlns:wpi="http://schemas.microsoft.com/office/word/2010/wordprocessingInk" xmlns:wne="http://schemas.microsoft.com/office/word/2006/wordml" xmlns:wps="http://schemas.microsoft.com/office/word/2010/wordprocessingShape" mc:Ignorable="w14 w15 w16se w16cid w16 w16cex w16sdtdh w16du wp14">
   <w:abstractNum w:abstractNumId="0" w15:restartNumberingAfterBreak="0">
-    <w:nsid w:val="010C5C10"/>
+    <w:nsid w:val="00C12475"/>
     <w:multiLevelType w:val="multilevel"/>
-    <w:tmpl w:val="32AA06C6"/>
+    <w:tmpl w:val="C95EC1E8"/>
     <w:lvl w:ilvl="0">
       <w:start w:val="1"/>
       <w:numFmt w:val="bullet"/>
@@ -6915,9 +6972,9 @@
     </w:lvl>
   </w:abstractNum>
   <w:abstractNum w:abstractNumId="1" w15:restartNumberingAfterBreak="0">
-    <w:nsid w:val="022A358C"/>
+    <w:nsid w:val="1469360E"/>
     <w:multiLevelType w:val="multilevel"/>
-    <w:tmpl w:val="14742E22"/>
+    <w:tmpl w:val="F0A2091C"/>
     <w:lvl w:ilvl="0">
       <w:start w:val="1"/>
       <w:numFmt w:val="bullet"/>
@@ -7028,122 +7085,9 @@
     </w:lvl>
   </w:abstractNum>
   <w:abstractNum w:abstractNumId="2" w15:restartNumberingAfterBreak="0">
-    <w:nsid w:val="07A91B5D"/>
+    <w:nsid w:val="29474A2E"/>
     <w:multiLevelType w:val="multilevel"/>
-    <w:tmpl w:val="D02E035C"/>
-    <w:lvl w:ilvl="0">
-      <w:start w:val="1"/>
-      <w:numFmt w:val="bullet"/>
-      <w:lvlText w:val="●"/>
-      <w:lvlJc w:val="left"/>
-      <w:pPr>
-        <w:ind w:left="720" w:hanging="360"/>
-      </w:pPr>
-      <w:rPr>
-        <w:u w:val="none"/>
-      </w:rPr>
-    </w:lvl>
-    <w:lvl w:ilvl="1">
-      <w:start w:val="1"/>
-      <w:numFmt w:val="bullet"/>
-      <w:lvlText w:val="○"/>
-      <w:lvlJc w:val="left"/>
-      <w:pPr>
-        <w:ind w:left="1440" w:hanging="360"/>
-      </w:pPr>
-      <w:rPr>
-        <w:u w:val="none"/>
-      </w:rPr>
-    </w:lvl>
-    <w:lvl w:ilvl="2">
-      <w:start w:val="1"/>
-      <w:numFmt w:val="bullet"/>
-      <w:lvlText w:val="■"/>
-      <w:lvlJc w:val="left"/>
-      <w:pPr>
-        <w:ind w:left="2160" w:hanging="360"/>
-      </w:pPr>
-      <w:rPr>
-        <w:u w:val="none"/>
-      </w:rPr>
-    </w:lvl>
-    <w:lvl w:ilvl="3">
-      <w:start w:val="1"/>
-      <w:numFmt w:val="bullet"/>
-      <w:lvlText w:val="●"/>
-      <w:lvlJc w:val="left"/>
-      <w:pPr>
-        <w:ind w:left="2880" w:hanging="360"/>
-      </w:pPr>
-      <w:rPr>
-        <w:u w:val="none"/>
-      </w:rPr>
-    </w:lvl>
-    <w:lvl w:ilvl="4">
-      <w:start w:val="1"/>
-      <w:numFmt w:val="bullet"/>
-      <w:lvlText w:val="○"/>
-      <w:lvlJc w:val="left"/>
-      <w:pPr>
-        <w:ind w:left="3600" w:hanging="360"/>
-      </w:pPr>
-      <w:rPr>
-        <w:u w:val="none"/>
-      </w:rPr>
-    </w:lvl>
-    <w:lvl w:ilvl="5">
-      <w:start w:val="1"/>
-      <w:numFmt w:val="bullet"/>
-      <w:lvlText w:val="■"/>
-      <w:lvlJc w:val="left"/>
-      <w:pPr>
-        <w:ind w:left="4320" w:hanging="360"/>
-      </w:pPr>
-      <w:rPr>
-        <w:u w:val="none"/>
-      </w:rPr>
-    </w:lvl>
-    <w:lvl w:ilvl="6">
-      <w:start w:val="1"/>
-      <w:numFmt w:val="bullet"/>
-      <w:lvlText w:val="●"/>
-      <w:lvlJc w:val="left"/>
-      <w:pPr>
-        <w:ind w:left="5040" w:hanging="360"/>
-      </w:pPr>
-      <w:rPr>
-        <w:u w:val="none"/>
-      </w:rPr>
-    </w:lvl>
-    <w:lvl w:ilvl="7">
-      <w:start w:val="1"/>
-      <w:numFmt w:val="bullet"/>
-      <w:lvlText w:val="○"/>
-      <w:lvlJc w:val="left"/>
-      <w:pPr>
-        <w:ind w:left="5760" w:hanging="360"/>
-      </w:pPr>
-      <w:rPr>
-        <w:u w:val="none"/>
-      </w:rPr>
-    </w:lvl>
-    <w:lvl w:ilvl="8">
-      <w:start w:val="1"/>
-      <w:numFmt w:val="bullet"/>
-      <w:lvlText w:val="■"/>
-      <w:lvlJc w:val="left"/>
-      <w:pPr>
-        <w:ind w:left="6480" w:hanging="360"/>
-      </w:pPr>
-      <w:rPr>
-        <w:u w:val="none"/>
-      </w:rPr>
-    </w:lvl>
-  </w:abstractNum>
-  <w:abstractNum w:abstractNumId="3" w15:restartNumberingAfterBreak="0">
-    <w:nsid w:val="08A963C0"/>
-    <w:multiLevelType w:val="multilevel"/>
-    <w:tmpl w:val="3454C982"/>
+    <w:tmpl w:val="FAE48556"/>
     <w:lvl w:ilvl="0">
       <w:start w:val="1"/>
       <w:numFmt w:val="decimal"/>
@@ -7253,127 +7197,14 @@
       </w:rPr>
     </w:lvl>
   </w:abstractNum>
-  <w:abstractNum w:abstractNumId="4" w15:restartNumberingAfterBreak="0">
-    <w:nsid w:val="08C63C8C"/>
+  <w:abstractNum w:abstractNumId="3" w15:restartNumberingAfterBreak="0">
+    <w:nsid w:val="29636A8D"/>
     <w:multiLevelType w:val="multilevel"/>
-    <w:tmpl w:val="20FCAD9E"/>
+    <w:tmpl w:val="E4146AE6"/>
     <w:lvl w:ilvl="0">
       <w:start w:val="1"/>
       <w:numFmt w:val="decimal"/>
       <w:lvlText w:val="%1."/>
-      <w:lvlJc w:val="left"/>
-      <w:pPr>
-        <w:ind w:left="720" w:hanging="360"/>
-      </w:pPr>
-      <w:rPr>
-        <w:u w:val="none"/>
-      </w:rPr>
-    </w:lvl>
-    <w:lvl w:ilvl="1">
-      <w:start w:val="1"/>
-      <w:numFmt w:val="lowerLetter"/>
-      <w:lvlText w:val="%2."/>
-      <w:lvlJc w:val="left"/>
-      <w:pPr>
-        <w:ind w:left="1440" w:hanging="360"/>
-      </w:pPr>
-      <w:rPr>
-        <w:u w:val="none"/>
-      </w:rPr>
-    </w:lvl>
-    <w:lvl w:ilvl="2">
-      <w:start w:val="1"/>
-      <w:numFmt w:val="lowerRoman"/>
-      <w:lvlText w:val="%3."/>
-      <w:lvlJc w:val="right"/>
-      <w:pPr>
-        <w:ind w:left="2160" w:hanging="360"/>
-      </w:pPr>
-      <w:rPr>
-        <w:u w:val="none"/>
-      </w:rPr>
-    </w:lvl>
-    <w:lvl w:ilvl="3">
-      <w:start w:val="1"/>
-      <w:numFmt w:val="decimal"/>
-      <w:lvlText w:val="%4."/>
-      <w:lvlJc w:val="left"/>
-      <w:pPr>
-        <w:ind w:left="2880" w:hanging="360"/>
-      </w:pPr>
-      <w:rPr>
-        <w:u w:val="none"/>
-      </w:rPr>
-    </w:lvl>
-    <w:lvl w:ilvl="4">
-      <w:start w:val="1"/>
-      <w:numFmt w:val="lowerLetter"/>
-      <w:lvlText w:val="%5."/>
-      <w:lvlJc w:val="left"/>
-      <w:pPr>
-        <w:ind w:left="3600" w:hanging="360"/>
-      </w:pPr>
-      <w:rPr>
-        <w:u w:val="none"/>
-      </w:rPr>
-    </w:lvl>
-    <w:lvl w:ilvl="5">
-      <w:start w:val="1"/>
-      <w:numFmt w:val="lowerRoman"/>
-      <w:lvlText w:val="%6."/>
-      <w:lvlJc w:val="right"/>
-      <w:pPr>
-        <w:ind w:left="4320" w:hanging="360"/>
-      </w:pPr>
-      <w:rPr>
-        <w:u w:val="none"/>
-      </w:rPr>
-    </w:lvl>
-    <w:lvl w:ilvl="6">
-      <w:start w:val="1"/>
-      <w:numFmt w:val="decimal"/>
-      <w:lvlText w:val="%7."/>
-      <w:lvlJc w:val="left"/>
-      <w:pPr>
-        <w:ind w:left="5040" w:hanging="360"/>
-      </w:pPr>
-      <w:rPr>
-        <w:u w:val="none"/>
-      </w:rPr>
-    </w:lvl>
-    <w:lvl w:ilvl="7">
-      <w:start w:val="1"/>
-      <w:numFmt w:val="lowerLetter"/>
-      <w:lvlText w:val="%8."/>
-      <w:lvlJc w:val="left"/>
-      <w:pPr>
-        <w:ind w:left="5760" w:hanging="360"/>
-      </w:pPr>
-      <w:rPr>
-        <w:u w:val="none"/>
-      </w:rPr>
-    </w:lvl>
-    <w:lvl w:ilvl="8">
-      <w:start w:val="1"/>
-      <w:numFmt w:val="lowerRoman"/>
-      <w:lvlText w:val="%9."/>
-      <w:lvlJc w:val="right"/>
-      <w:pPr>
-        <w:ind w:left="6480" w:hanging="360"/>
-      </w:pPr>
-      <w:rPr>
-        <w:u w:val="none"/>
-      </w:rPr>
-    </w:lvl>
-  </w:abstractNum>
-  <w:abstractNum w:abstractNumId="5" w15:restartNumberingAfterBreak="0">
-    <w:nsid w:val="0D995C07"/>
-    <w:multiLevelType w:val="multilevel"/>
-    <w:tmpl w:val="6E60B258"/>
-    <w:lvl w:ilvl="0">
-      <w:start w:val="1"/>
-      <w:numFmt w:val="bullet"/>
-      <w:lvlText w:val="●"/>
       <w:lvlJc w:val="left"/>
       <w:pPr>
         <w:ind w:left="720" w:hanging="360"/>
@@ -7414,122 +7245,9 @@
     </w:lvl>
     <w:lvl w:ilvl="2">
       <w:start w:val="1"/>
-      <w:numFmt w:val="bullet"/>
-      <w:lvlText w:val="■"/>
-      <w:lvlJc w:val="left"/>
-      <w:pPr>
-        <w:ind w:left="2160" w:hanging="360"/>
-      </w:pPr>
-      <w:rPr>
-        <w:u w:val="none"/>
-      </w:rPr>
-    </w:lvl>
-    <w:lvl w:ilvl="3">
-      <w:start w:val="1"/>
-      <w:numFmt w:val="bullet"/>
-      <w:lvlText w:val="●"/>
-      <w:lvlJc w:val="left"/>
-      <w:pPr>
-        <w:ind w:left="2880" w:hanging="360"/>
-      </w:pPr>
-      <w:rPr>
-        <w:u w:val="none"/>
-      </w:rPr>
-    </w:lvl>
-    <w:lvl w:ilvl="4">
-      <w:start w:val="1"/>
-      <w:numFmt w:val="bullet"/>
-      <w:lvlText w:val="○"/>
-      <w:lvlJc w:val="left"/>
-      <w:pPr>
-        <w:ind w:left="3600" w:hanging="360"/>
-      </w:pPr>
-      <w:rPr>
-        <w:u w:val="none"/>
-      </w:rPr>
-    </w:lvl>
-    <w:lvl w:ilvl="5">
-      <w:start w:val="1"/>
-      <w:numFmt w:val="bullet"/>
-      <w:lvlText w:val="■"/>
-      <w:lvlJc w:val="left"/>
-      <w:pPr>
-        <w:ind w:left="4320" w:hanging="360"/>
-      </w:pPr>
-      <w:rPr>
-        <w:u w:val="none"/>
-      </w:rPr>
-    </w:lvl>
-    <w:lvl w:ilvl="6">
-      <w:start w:val="1"/>
-      <w:numFmt w:val="bullet"/>
-      <w:lvlText w:val="●"/>
-      <w:lvlJc w:val="left"/>
-      <w:pPr>
-        <w:ind w:left="5040" w:hanging="360"/>
-      </w:pPr>
-      <w:rPr>
-        <w:u w:val="none"/>
-      </w:rPr>
-    </w:lvl>
-    <w:lvl w:ilvl="7">
-      <w:start w:val="1"/>
-      <w:numFmt w:val="bullet"/>
-      <w:lvlText w:val="○"/>
-      <w:lvlJc w:val="left"/>
-      <w:pPr>
-        <w:ind w:left="5760" w:hanging="360"/>
-      </w:pPr>
-      <w:rPr>
-        <w:u w:val="none"/>
-      </w:rPr>
-    </w:lvl>
-    <w:lvl w:ilvl="8">
-      <w:start w:val="1"/>
-      <w:numFmt w:val="bullet"/>
-      <w:lvlText w:val="■"/>
-      <w:lvlJc w:val="left"/>
-      <w:pPr>
-        <w:ind w:left="6480" w:hanging="360"/>
-      </w:pPr>
-      <w:rPr>
-        <w:u w:val="none"/>
-      </w:rPr>
-    </w:lvl>
-  </w:abstractNum>
-  <w:abstractNum w:abstractNumId="6" w15:restartNumberingAfterBreak="0">
-    <w:nsid w:val="2BCD1FD6"/>
-    <w:multiLevelType w:val="multilevel"/>
-    <w:tmpl w:val="1C02BEC6"/>
-    <w:lvl w:ilvl="0">
-      <w:start w:val="1"/>
-      <w:numFmt w:val="decimal"/>
-      <w:lvlText w:val="%1."/>
-      <w:lvlJc w:val="left"/>
-      <w:pPr>
-        <w:ind w:left="720" w:hanging="360"/>
-      </w:pPr>
-      <w:rPr>
-        <w:u w:val="none"/>
-      </w:rPr>
-    </w:lvl>
-    <w:lvl w:ilvl="1">
-      <w:start w:val="1"/>
-      <w:numFmt w:val="lowerLetter"/>
-      <w:lvlText w:val="%2."/>
-      <w:lvlJc w:val="left"/>
-      <w:pPr>
-        <w:ind w:left="1440" w:hanging="360"/>
-      </w:pPr>
-      <w:rPr>
-        <w:u w:val="none"/>
-      </w:rPr>
-    </w:lvl>
-    <w:lvl w:ilvl="2">
-      <w:start w:val="1"/>
       <w:numFmt w:val="lowerRoman"/>
       <w:lvlText w:val="%3."/>
-      <w:lvlJc w:val="right"/>
+      <w:lvlJc w:val="left"/>
       <w:pPr>
         <w:ind w:left="2160" w:hanging="360"/>
       </w:pPr>
@@ -7565,7 +7283,7 @@
       <w:start w:val="1"/>
       <w:numFmt w:val="lowerRoman"/>
       <w:lvlText w:val="%6."/>
-      <w:lvlJc w:val="right"/>
+      <w:lvlJc w:val="left"/>
       <w:pPr>
         <w:ind w:left="4320" w:hanging="360"/>
       </w:pPr>
@@ -7601,7 +7319,7 @@
       <w:start w:val="1"/>
       <w:numFmt w:val="lowerRoman"/>
       <w:lvlText w:val="%9."/>
-      <w:lvlJc w:val="right"/>
+      <w:lvlJc w:val="left"/>
       <w:pPr>
         <w:ind w:left="6480" w:hanging="360"/>
       </w:pPr>
@@ -7610,123 +7328,10 @@
       </w:rPr>
     </w:lvl>
   </w:abstractNum>
-  <w:abstractNum w:abstractNumId="7" w15:restartNumberingAfterBreak="0">
-    <w:nsid w:val="34A900F1"/>
+  <w:abstractNum w:abstractNumId="4" w15:restartNumberingAfterBreak="0">
+    <w:nsid w:val="32563C43"/>
     <w:multiLevelType w:val="multilevel"/>
-    <w:tmpl w:val="B45CA32E"/>
-    <w:lvl w:ilvl="0">
-      <w:start w:val="1"/>
-      <w:numFmt w:val="decimal"/>
-      <w:lvlText w:val="%1."/>
-      <w:lvlJc w:val="left"/>
-      <w:pPr>
-        <w:ind w:left="720" w:hanging="360"/>
-      </w:pPr>
-      <w:rPr>
-        <w:u w:val="none"/>
-      </w:rPr>
-    </w:lvl>
-    <w:lvl w:ilvl="1">
-      <w:start w:val="1"/>
-      <w:numFmt w:val="lowerLetter"/>
-      <w:lvlText w:val="%2."/>
-      <w:lvlJc w:val="left"/>
-      <w:pPr>
-        <w:ind w:left="1440" w:hanging="360"/>
-      </w:pPr>
-      <w:rPr>
-        <w:u w:val="none"/>
-      </w:rPr>
-    </w:lvl>
-    <w:lvl w:ilvl="2">
-      <w:start w:val="1"/>
-      <w:numFmt w:val="lowerRoman"/>
-      <w:lvlText w:val="%3."/>
-      <w:lvlJc w:val="right"/>
-      <w:pPr>
-        <w:ind w:left="2160" w:hanging="360"/>
-      </w:pPr>
-      <w:rPr>
-        <w:u w:val="none"/>
-      </w:rPr>
-    </w:lvl>
-    <w:lvl w:ilvl="3">
-      <w:start w:val="1"/>
-      <w:numFmt w:val="decimal"/>
-      <w:lvlText w:val="%4."/>
-      <w:lvlJc w:val="left"/>
-      <w:pPr>
-        <w:ind w:left="2880" w:hanging="360"/>
-      </w:pPr>
-      <w:rPr>
-        <w:u w:val="none"/>
-      </w:rPr>
-    </w:lvl>
-    <w:lvl w:ilvl="4">
-      <w:start w:val="1"/>
-      <w:numFmt w:val="lowerLetter"/>
-      <w:lvlText w:val="%5."/>
-      <w:lvlJc w:val="left"/>
-      <w:pPr>
-        <w:ind w:left="3600" w:hanging="360"/>
-      </w:pPr>
-      <w:rPr>
-        <w:u w:val="none"/>
-      </w:rPr>
-    </w:lvl>
-    <w:lvl w:ilvl="5">
-      <w:start w:val="1"/>
-      <w:numFmt w:val="lowerRoman"/>
-      <w:lvlText w:val="%6."/>
-      <w:lvlJc w:val="right"/>
-      <w:pPr>
-        <w:ind w:left="4320" w:hanging="360"/>
-      </w:pPr>
-      <w:rPr>
-        <w:u w:val="none"/>
-      </w:rPr>
-    </w:lvl>
-    <w:lvl w:ilvl="6">
-      <w:start w:val="1"/>
-      <w:numFmt w:val="decimal"/>
-      <w:lvlText w:val="%7."/>
-      <w:lvlJc w:val="left"/>
-      <w:pPr>
-        <w:ind w:left="5040" w:hanging="360"/>
-      </w:pPr>
-      <w:rPr>
-        <w:u w:val="none"/>
-      </w:rPr>
-    </w:lvl>
-    <w:lvl w:ilvl="7">
-      <w:start w:val="1"/>
-      <w:numFmt w:val="lowerLetter"/>
-      <w:lvlText w:val="%8."/>
-      <w:lvlJc w:val="left"/>
-      <w:pPr>
-        <w:ind w:left="5760" w:hanging="360"/>
-      </w:pPr>
-      <w:rPr>
-        <w:u w:val="none"/>
-      </w:rPr>
-    </w:lvl>
-    <w:lvl w:ilvl="8">
-      <w:start w:val="1"/>
-      <w:numFmt w:val="lowerRoman"/>
-      <w:lvlText w:val="%9."/>
-      <w:lvlJc w:val="right"/>
-      <w:pPr>
-        <w:ind w:left="6480" w:hanging="360"/>
-      </w:pPr>
-      <w:rPr>
-        <w:u w:val="none"/>
-      </w:rPr>
-    </w:lvl>
-  </w:abstractNum>
-  <w:abstractNum w:abstractNumId="8" w15:restartNumberingAfterBreak="0">
-    <w:nsid w:val="36CB3C34"/>
-    <w:multiLevelType w:val="multilevel"/>
-    <w:tmpl w:val="99C805D8"/>
+    <w:tmpl w:val="11761D74"/>
     <w:lvl w:ilvl="0">
       <w:start w:val="1"/>
       <w:numFmt w:val="bullet"/>
@@ -7845,13 +7450,13 @@
       </w:rPr>
     </w:lvl>
   </w:abstractNum>
-  <w:abstractNum w:abstractNumId="9" w15:restartNumberingAfterBreak="0">
-    <w:nsid w:val="4CC73038"/>
+  <w:abstractNum w:abstractNumId="5" w15:restartNumberingAfterBreak="0">
+    <w:nsid w:val="36DE3202"/>
     <w:multiLevelType w:val="multilevel"/>
-    <w:tmpl w:val="0DC470E0"/>
+    <w:tmpl w:val="6220C426"/>
     <w:lvl w:ilvl="0">
       <w:start w:val="1"/>
-      <w:numFmt w:val="decimal"/>
+      <w:numFmt w:val="upperLetter"/>
       <w:lvlText w:val="%1."/>
       <w:lvlJc w:val="left"/>
       <w:pPr>
@@ -7958,10 +7563,123 @@
       </w:rPr>
     </w:lvl>
   </w:abstractNum>
-  <w:abstractNum w:abstractNumId="10" w15:restartNumberingAfterBreak="0">
-    <w:nsid w:val="52A55621"/>
+  <w:abstractNum w:abstractNumId="6" w15:restartNumberingAfterBreak="0">
+    <w:nsid w:val="3ABD1BFE"/>
     <w:multiLevelType w:val="multilevel"/>
-    <w:tmpl w:val="ED768BC0"/>
+    <w:tmpl w:val="1F28B6F4"/>
+    <w:lvl w:ilvl="0">
+      <w:start w:val="1"/>
+      <w:numFmt w:val="decimal"/>
+      <w:lvlText w:val="%1."/>
+      <w:lvlJc w:val="left"/>
+      <w:pPr>
+        <w:ind w:left="720" w:hanging="360"/>
+      </w:pPr>
+      <w:rPr>
+        <w:u w:val="none"/>
+      </w:rPr>
+    </w:lvl>
+    <w:lvl w:ilvl="1">
+      <w:start w:val="1"/>
+      <w:numFmt w:val="lowerLetter"/>
+      <w:lvlText w:val="%2."/>
+      <w:lvlJc w:val="left"/>
+      <w:pPr>
+        <w:ind w:left="1440" w:hanging="360"/>
+      </w:pPr>
+      <w:rPr>
+        <w:u w:val="none"/>
+      </w:rPr>
+    </w:lvl>
+    <w:lvl w:ilvl="2">
+      <w:start w:val="1"/>
+      <w:numFmt w:val="lowerRoman"/>
+      <w:lvlText w:val="%3."/>
+      <w:lvlJc w:val="right"/>
+      <w:pPr>
+        <w:ind w:left="2160" w:hanging="360"/>
+      </w:pPr>
+      <w:rPr>
+        <w:u w:val="none"/>
+      </w:rPr>
+    </w:lvl>
+    <w:lvl w:ilvl="3">
+      <w:start w:val="1"/>
+      <w:numFmt w:val="decimal"/>
+      <w:lvlText w:val="%4."/>
+      <w:lvlJc w:val="left"/>
+      <w:pPr>
+        <w:ind w:left="2880" w:hanging="360"/>
+      </w:pPr>
+      <w:rPr>
+        <w:u w:val="none"/>
+      </w:rPr>
+    </w:lvl>
+    <w:lvl w:ilvl="4">
+      <w:start w:val="1"/>
+      <w:numFmt w:val="lowerLetter"/>
+      <w:lvlText w:val="%5."/>
+      <w:lvlJc w:val="left"/>
+      <w:pPr>
+        <w:ind w:left="3600" w:hanging="360"/>
+      </w:pPr>
+      <w:rPr>
+        <w:u w:val="none"/>
+      </w:rPr>
+    </w:lvl>
+    <w:lvl w:ilvl="5">
+      <w:start w:val="1"/>
+      <w:numFmt w:val="lowerRoman"/>
+      <w:lvlText w:val="%6."/>
+      <w:lvlJc w:val="right"/>
+      <w:pPr>
+        <w:ind w:left="4320" w:hanging="360"/>
+      </w:pPr>
+      <w:rPr>
+        <w:u w:val="none"/>
+      </w:rPr>
+    </w:lvl>
+    <w:lvl w:ilvl="6">
+      <w:start w:val="1"/>
+      <w:numFmt w:val="decimal"/>
+      <w:lvlText w:val="%7."/>
+      <w:lvlJc w:val="left"/>
+      <w:pPr>
+        <w:ind w:left="5040" w:hanging="360"/>
+      </w:pPr>
+      <w:rPr>
+        <w:u w:val="none"/>
+      </w:rPr>
+    </w:lvl>
+    <w:lvl w:ilvl="7">
+      <w:start w:val="1"/>
+      <w:numFmt w:val="lowerLetter"/>
+      <w:lvlText w:val="%8."/>
+      <w:lvlJc w:val="left"/>
+      <w:pPr>
+        <w:ind w:left="5760" w:hanging="360"/>
+      </w:pPr>
+      <w:rPr>
+        <w:u w:val="none"/>
+      </w:rPr>
+    </w:lvl>
+    <w:lvl w:ilvl="8">
+      <w:start w:val="1"/>
+      <w:numFmt w:val="lowerRoman"/>
+      <w:lvlText w:val="%9."/>
+      <w:lvlJc w:val="right"/>
+      <w:pPr>
+        <w:ind w:left="6480" w:hanging="360"/>
+      </w:pPr>
+      <w:rPr>
+        <w:u w:val="none"/>
+      </w:rPr>
+    </w:lvl>
+  </w:abstractNum>
+  <w:abstractNum w:abstractNumId="7" w15:restartNumberingAfterBreak="0">
+    <w:nsid w:val="3C9D2408"/>
+    <w:multiLevelType w:val="multilevel"/>
+    <w:tmpl w:val="18AE416C"/>
     <w:lvl w:ilvl="0">
       <w:start w:val="1"/>
       <w:numFmt w:val="bullet"/>
@@ -8080,10 +7798,10 @@
       </w:rPr>
     </w:lvl>
   </w:abstractNum>
-  <w:abstractNum w:abstractNumId="11" w15:restartNumberingAfterBreak="0">
-    <w:nsid w:val="5D6940F1"/>
+  <w:abstractNum w:abstractNumId="8" w15:restartNumberingAfterBreak="0">
+    <w:nsid w:val="4D876760"/>
     <w:multiLevelType w:val="multilevel"/>
-    <w:tmpl w:val="448E7C06"/>
+    <w:tmpl w:val="41FE2A96"/>
     <w:lvl w:ilvl="0">
       <w:start w:val="1"/>
       <w:numFmt w:val="bullet"/>
@@ -8107,6 +7825,1059 @@
     </w:lvl>
     <w:lvl w:ilvl="1">
       <w:start w:val="1"/>
+      <w:numFmt w:val="bullet"/>
+      <w:lvlText w:val="○"/>
+      <w:lvlJc w:val="left"/>
+      <w:pPr>
+        <w:ind w:left="1440" w:hanging="360"/>
+      </w:pPr>
+      <w:rPr>
+        <w:rFonts w:ascii="Arial" w:eastAsia="Arial" w:hAnsi="Arial" w:cs="Arial"/>
+        <w:b w:val="0"/>
+        <w:bCs w:val="0"/>
+        <w:i w:val="0"/>
+        <w:iCs w:val="0"/>
+        <w:smallCaps w:val="0"/>
+        <w:color w:val="CBCEBC"/>
+        <w:sz w:val="21"/>
+        <w:szCs w:val="21"/>
+        <w:u w:val="none"/>
+      </w:rPr>
+    </w:lvl>
+    <w:lvl w:ilvl="2">
+      <w:start w:val="1"/>
+      <w:numFmt w:val="bullet"/>
+      <w:lvlText w:val="■"/>
+      <w:lvlJc w:val="left"/>
+      <w:pPr>
+        <w:ind w:left="2160" w:hanging="360"/>
+      </w:pPr>
+      <w:rPr>
+        <w:u w:val="none"/>
+      </w:rPr>
+    </w:lvl>
+    <w:lvl w:ilvl="3">
+      <w:start w:val="1"/>
+      <w:numFmt w:val="bullet"/>
+      <w:lvlText w:val="●"/>
+      <w:lvlJc w:val="left"/>
+      <w:pPr>
+        <w:ind w:left="2880" w:hanging="360"/>
+      </w:pPr>
+      <w:rPr>
+        <w:u w:val="none"/>
+      </w:rPr>
+    </w:lvl>
+    <w:lvl w:ilvl="4">
+      <w:start w:val="1"/>
+      <w:numFmt w:val="bullet"/>
+      <w:lvlText w:val="○"/>
+      <w:lvlJc w:val="left"/>
+      <w:pPr>
+        <w:ind w:left="3600" w:hanging="360"/>
+      </w:pPr>
+      <w:rPr>
+        <w:u w:val="none"/>
+      </w:rPr>
+    </w:lvl>
+    <w:lvl w:ilvl="5">
+      <w:start w:val="1"/>
+      <w:numFmt w:val="bullet"/>
+      <w:lvlText w:val="■"/>
+      <w:lvlJc w:val="left"/>
+      <w:pPr>
+        <w:ind w:left="4320" w:hanging="360"/>
+      </w:pPr>
+      <w:rPr>
+        <w:u w:val="none"/>
+      </w:rPr>
+    </w:lvl>
+    <w:lvl w:ilvl="6">
+      <w:start w:val="1"/>
+      <w:numFmt w:val="bullet"/>
+      <w:lvlText w:val="●"/>
+      <w:lvlJc w:val="left"/>
+      <w:pPr>
+        <w:ind w:left="5040" w:hanging="360"/>
+      </w:pPr>
+      <w:rPr>
+        <w:u w:val="none"/>
+      </w:rPr>
+    </w:lvl>
+    <w:lvl w:ilvl="7">
+      <w:start w:val="1"/>
+      <w:numFmt w:val="bullet"/>
+      <w:lvlText w:val="○"/>
+      <w:lvlJc w:val="left"/>
+      <w:pPr>
+        <w:ind w:left="5760" w:hanging="360"/>
+      </w:pPr>
+      <w:rPr>
+        <w:u w:val="none"/>
+      </w:rPr>
+    </w:lvl>
+    <w:lvl w:ilvl="8">
+      <w:start w:val="1"/>
+      <w:numFmt w:val="bullet"/>
+      <w:lvlText w:val="■"/>
+      <w:lvlJc w:val="left"/>
+      <w:pPr>
+        <w:ind w:left="6480" w:hanging="360"/>
+      </w:pPr>
+      <w:rPr>
+        <w:u w:val="none"/>
+      </w:rPr>
+    </w:lvl>
+  </w:abstractNum>
+  <w:abstractNum w:abstractNumId="9" w15:restartNumberingAfterBreak="0">
+    <w:nsid w:val="4F8158DB"/>
+    <w:multiLevelType w:val="multilevel"/>
+    <w:tmpl w:val="283268E8"/>
+    <w:lvl w:ilvl="0">
+      <w:start w:val="1"/>
+      <w:numFmt w:val="decimal"/>
+      <w:lvlText w:val="%1."/>
+      <w:lvlJc w:val="left"/>
+      <w:pPr>
+        <w:ind w:left="720" w:hanging="360"/>
+      </w:pPr>
+      <w:rPr>
+        <w:u w:val="none"/>
+      </w:rPr>
+    </w:lvl>
+    <w:lvl w:ilvl="1">
+      <w:start w:val="1"/>
+      <w:numFmt w:val="lowerLetter"/>
+      <w:lvlText w:val="%2."/>
+      <w:lvlJc w:val="left"/>
+      <w:pPr>
+        <w:ind w:left="1440" w:hanging="360"/>
+      </w:pPr>
+      <w:rPr>
+        <w:u w:val="none"/>
+      </w:rPr>
+    </w:lvl>
+    <w:lvl w:ilvl="2">
+      <w:start w:val="1"/>
+      <w:numFmt w:val="lowerRoman"/>
+      <w:lvlText w:val="%3."/>
+      <w:lvlJc w:val="right"/>
+      <w:pPr>
+        <w:ind w:left="2160" w:hanging="360"/>
+      </w:pPr>
+      <w:rPr>
+        <w:u w:val="none"/>
+      </w:rPr>
+    </w:lvl>
+    <w:lvl w:ilvl="3">
+      <w:start w:val="1"/>
+      <w:numFmt w:val="decimal"/>
+      <w:lvlText w:val="%4."/>
+      <w:lvlJc w:val="left"/>
+      <w:pPr>
+        <w:ind w:left="2880" w:hanging="360"/>
+      </w:pPr>
+      <w:rPr>
+        <w:u w:val="none"/>
+      </w:rPr>
+    </w:lvl>
+    <w:lvl w:ilvl="4">
+      <w:start w:val="1"/>
+      <w:numFmt w:val="lowerLetter"/>
+      <w:lvlText w:val="%5."/>
+      <w:lvlJc w:val="left"/>
+      <w:pPr>
+        <w:ind w:left="3600" w:hanging="360"/>
+      </w:pPr>
+      <w:rPr>
+        <w:u w:val="none"/>
+      </w:rPr>
+    </w:lvl>
+    <w:lvl w:ilvl="5">
+      <w:start w:val="1"/>
+      <w:numFmt w:val="lowerRoman"/>
+      <w:lvlText w:val="%6."/>
+      <w:lvlJc w:val="right"/>
+      <w:pPr>
+        <w:ind w:left="4320" w:hanging="360"/>
+      </w:pPr>
+      <w:rPr>
+        <w:u w:val="none"/>
+      </w:rPr>
+    </w:lvl>
+    <w:lvl w:ilvl="6">
+      <w:start w:val="1"/>
+      <w:numFmt w:val="decimal"/>
+      <w:lvlText w:val="%7."/>
+      <w:lvlJc w:val="left"/>
+      <w:pPr>
+        <w:ind w:left="5040" w:hanging="360"/>
+      </w:pPr>
+      <w:rPr>
+        <w:u w:val="none"/>
+      </w:rPr>
+    </w:lvl>
+    <w:lvl w:ilvl="7">
+      <w:start w:val="1"/>
+      <w:numFmt w:val="lowerLetter"/>
+      <w:lvlText w:val="%8."/>
+      <w:lvlJc w:val="left"/>
+      <w:pPr>
+        <w:ind w:left="5760" w:hanging="360"/>
+      </w:pPr>
+      <w:rPr>
+        <w:u w:val="none"/>
+      </w:rPr>
+    </w:lvl>
+    <w:lvl w:ilvl="8">
+      <w:start w:val="1"/>
+      <w:numFmt w:val="lowerRoman"/>
+      <w:lvlText w:val="%9."/>
+      <w:lvlJc w:val="right"/>
+      <w:pPr>
+        <w:ind w:left="6480" w:hanging="360"/>
+      </w:pPr>
+      <w:rPr>
+        <w:u w:val="none"/>
+      </w:rPr>
+    </w:lvl>
+  </w:abstractNum>
+  <w:abstractNum w:abstractNumId="10" w15:restartNumberingAfterBreak="0">
+    <w:nsid w:val="515E525C"/>
+    <w:multiLevelType w:val="multilevel"/>
+    <w:tmpl w:val="A3CC3344"/>
+    <w:lvl w:ilvl="0">
+      <w:start w:val="1"/>
+      <w:numFmt w:val="decimal"/>
+      <w:lvlText w:val="%1."/>
+      <w:lvlJc w:val="left"/>
+      <w:pPr>
+        <w:ind w:left="720" w:hanging="360"/>
+      </w:pPr>
+      <w:rPr>
+        <w:u w:val="none"/>
+      </w:rPr>
+    </w:lvl>
+    <w:lvl w:ilvl="1">
+      <w:start w:val="1"/>
+      <w:numFmt w:val="lowerLetter"/>
+      <w:lvlText w:val="%2."/>
+      <w:lvlJc w:val="left"/>
+      <w:pPr>
+        <w:ind w:left="1440" w:hanging="360"/>
+      </w:pPr>
+      <w:rPr>
+        <w:u w:val="none"/>
+      </w:rPr>
+    </w:lvl>
+    <w:lvl w:ilvl="2">
+      <w:start w:val="1"/>
+      <w:numFmt w:val="lowerRoman"/>
+      <w:lvlText w:val="%3."/>
+      <w:lvlJc w:val="right"/>
+      <w:pPr>
+        <w:ind w:left="2160" w:hanging="360"/>
+      </w:pPr>
+      <w:rPr>
+        <w:u w:val="none"/>
+      </w:rPr>
+    </w:lvl>
+    <w:lvl w:ilvl="3">
+      <w:start w:val="1"/>
+      <w:numFmt w:val="decimal"/>
+      <w:lvlText w:val="%4."/>
+      <w:lvlJc w:val="left"/>
+      <w:pPr>
+        <w:ind w:left="2880" w:hanging="360"/>
+      </w:pPr>
+      <w:rPr>
+        <w:u w:val="none"/>
+      </w:rPr>
+    </w:lvl>
+    <w:lvl w:ilvl="4">
+      <w:start w:val="1"/>
+      <w:numFmt w:val="lowerLetter"/>
+      <w:lvlText w:val="%5."/>
+      <w:lvlJc w:val="left"/>
+      <w:pPr>
+        <w:ind w:left="3600" w:hanging="360"/>
+      </w:pPr>
+      <w:rPr>
+        <w:u w:val="none"/>
+      </w:rPr>
+    </w:lvl>
+    <w:lvl w:ilvl="5">
+      <w:start w:val="1"/>
+      <w:numFmt w:val="lowerRoman"/>
+      <w:lvlText w:val="%6."/>
+      <w:lvlJc w:val="right"/>
+      <w:pPr>
+        <w:ind w:left="4320" w:hanging="360"/>
+      </w:pPr>
+      <w:rPr>
+        <w:u w:val="none"/>
+      </w:rPr>
+    </w:lvl>
+    <w:lvl w:ilvl="6">
+      <w:start w:val="1"/>
+      <w:numFmt w:val="decimal"/>
+      <w:lvlText w:val="%7."/>
+      <w:lvlJc w:val="left"/>
+      <w:pPr>
+        <w:ind w:left="5040" w:hanging="360"/>
+      </w:pPr>
+      <w:rPr>
+        <w:u w:val="none"/>
+      </w:rPr>
+    </w:lvl>
+    <w:lvl w:ilvl="7">
+      <w:start w:val="1"/>
+      <w:numFmt w:val="lowerLetter"/>
+      <w:lvlText w:val="%8."/>
+      <w:lvlJc w:val="left"/>
+      <w:pPr>
+        <w:ind w:left="5760" w:hanging="360"/>
+      </w:pPr>
+      <w:rPr>
+        <w:u w:val="none"/>
+      </w:rPr>
+    </w:lvl>
+    <w:lvl w:ilvl="8">
+      <w:start w:val="1"/>
+      <w:numFmt w:val="lowerRoman"/>
+      <w:lvlText w:val="%9."/>
+      <w:lvlJc w:val="right"/>
+      <w:pPr>
+        <w:ind w:left="6480" w:hanging="360"/>
+      </w:pPr>
+      <w:rPr>
+        <w:u w:val="none"/>
+      </w:rPr>
+    </w:lvl>
+  </w:abstractNum>
+  <w:abstractNum w:abstractNumId="11" w15:restartNumberingAfterBreak="0">
+    <w:nsid w:val="530E7550"/>
+    <w:multiLevelType w:val="multilevel"/>
+    <w:tmpl w:val="9FAAE66A"/>
+    <w:lvl w:ilvl="0">
+      <w:start w:val="1"/>
+      <w:numFmt w:val="decimal"/>
+      <w:lvlText w:val="%1."/>
+      <w:lvlJc w:val="left"/>
+      <w:pPr>
+        <w:ind w:left="720" w:hanging="360"/>
+      </w:pPr>
+      <w:rPr>
+        <w:u w:val="none"/>
+      </w:rPr>
+    </w:lvl>
+    <w:lvl w:ilvl="1">
+      <w:start w:val="1"/>
+      <w:numFmt w:val="lowerLetter"/>
+      <w:lvlText w:val="%2."/>
+      <w:lvlJc w:val="left"/>
+      <w:pPr>
+        <w:ind w:left="1440" w:hanging="360"/>
+      </w:pPr>
+      <w:rPr>
+        <w:u w:val="none"/>
+      </w:rPr>
+    </w:lvl>
+    <w:lvl w:ilvl="2">
+      <w:start w:val="1"/>
+      <w:numFmt w:val="lowerRoman"/>
+      <w:lvlText w:val="%3."/>
+      <w:lvlJc w:val="right"/>
+      <w:pPr>
+        <w:ind w:left="2160" w:hanging="360"/>
+      </w:pPr>
+      <w:rPr>
+        <w:u w:val="none"/>
+      </w:rPr>
+    </w:lvl>
+    <w:lvl w:ilvl="3">
+      <w:start w:val="1"/>
+      <w:numFmt w:val="decimal"/>
+      <w:lvlText w:val="%4."/>
+      <w:lvlJc w:val="left"/>
+      <w:pPr>
+        <w:ind w:left="2880" w:hanging="360"/>
+      </w:pPr>
+      <w:rPr>
+        <w:u w:val="none"/>
+      </w:rPr>
+    </w:lvl>
+    <w:lvl w:ilvl="4">
+      <w:start w:val="1"/>
+      <w:numFmt w:val="lowerLetter"/>
+      <w:lvlText w:val="%5."/>
+      <w:lvlJc w:val="left"/>
+      <w:pPr>
+        <w:ind w:left="3600" w:hanging="360"/>
+      </w:pPr>
+      <w:rPr>
+        <w:u w:val="none"/>
+      </w:rPr>
+    </w:lvl>
+    <w:lvl w:ilvl="5">
+      <w:start w:val="1"/>
+      <w:numFmt w:val="lowerRoman"/>
+      <w:lvlText w:val="%6."/>
+      <w:lvlJc w:val="right"/>
+      <w:pPr>
+        <w:ind w:left="4320" w:hanging="360"/>
+      </w:pPr>
+      <w:rPr>
+        <w:u w:val="none"/>
+      </w:rPr>
+    </w:lvl>
+    <w:lvl w:ilvl="6">
+      <w:start w:val="1"/>
+      <w:numFmt w:val="decimal"/>
+      <w:lvlText w:val="%7."/>
+      <w:lvlJc w:val="left"/>
+      <w:pPr>
+        <w:ind w:left="5040" w:hanging="360"/>
+      </w:pPr>
+      <w:rPr>
+        <w:u w:val="none"/>
+      </w:rPr>
+    </w:lvl>
+    <w:lvl w:ilvl="7">
+      <w:start w:val="1"/>
+      <w:numFmt w:val="lowerLetter"/>
+      <w:lvlText w:val="%8."/>
+      <w:lvlJc w:val="left"/>
+      <w:pPr>
+        <w:ind w:left="5760" w:hanging="360"/>
+      </w:pPr>
+      <w:rPr>
+        <w:u w:val="none"/>
+      </w:rPr>
+    </w:lvl>
+    <w:lvl w:ilvl="8">
+      <w:start w:val="1"/>
+      <w:numFmt w:val="lowerRoman"/>
+      <w:lvlText w:val="%9."/>
+      <w:lvlJc w:val="right"/>
+      <w:pPr>
+        <w:ind w:left="6480" w:hanging="360"/>
+      </w:pPr>
+      <w:rPr>
+        <w:u w:val="none"/>
+      </w:rPr>
+    </w:lvl>
+  </w:abstractNum>
+  <w:abstractNum w:abstractNumId="12" w15:restartNumberingAfterBreak="0">
+    <w:nsid w:val="5993178F"/>
+    <w:multiLevelType w:val="multilevel"/>
+    <w:tmpl w:val="E6DAF2BA"/>
+    <w:lvl w:ilvl="0">
+      <w:start w:val="1"/>
+      <w:numFmt w:val="bullet"/>
+      <w:lvlText w:val="●"/>
+      <w:lvlJc w:val="left"/>
+      <w:pPr>
+        <w:ind w:left="720" w:hanging="360"/>
+      </w:pPr>
+      <w:rPr>
+        <w:u w:val="none"/>
+      </w:rPr>
+    </w:lvl>
+    <w:lvl w:ilvl="1">
+      <w:start w:val="1"/>
+      <w:numFmt w:val="bullet"/>
+      <w:lvlText w:val="○"/>
+      <w:lvlJc w:val="left"/>
+      <w:pPr>
+        <w:ind w:left="1440" w:hanging="360"/>
+      </w:pPr>
+      <w:rPr>
+        <w:u w:val="none"/>
+      </w:rPr>
+    </w:lvl>
+    <w:lvl w:ilvl="2">
+      <w:start w:val="1"/>
+      <w:numFmt w:val="bullet"/>
+      <w:lvlText w:val="■"/>
+      <w:lvlJc w:val="left"/>
+      <w:pPr>
+        <w:ind w:left="2160" w:hanging="360"/>
+      </w:pPr>
+      <w:rPr>
+        <w:u w:val="none"/>
+      </w:rPr>
+    </w:lvl>
+    <w:lvl w:ilvl="3">
+      <w:start w:val="1"/>
+      <w:numFmt w:val="bullet"/>
+      <w:lvlText w:val="●"/>
+      <w:lvlJc w:val="left"/>
+      <w:pPr>
+        <w:ind w:left="2880" w:hanging="360"/>
+      </w:pPr>
+      <w:rPr>
+        <w:u w:val="none"/>
+      </w:rPr>
+    </w:lvl>
+    <w:lvl w:ilvl="4">
+      <w:start w:val="1"/>
+      <w:numFmt w:val="bullet"/>
+      <w:lvlText w:val="○"/>
+      <w:lvlJc w:val="left"/>
+      <w:pPr>
+        <w:ind w:left="3600" w:hanging="360"/>
+      </w:pPr>
+      <w:rPr>
+        <w:u w:val="none"/>
+      </w:rPr>
+    </w:lvl>
+    <w:lvl w:ilvl="5">
+      <w:start w:val="1"/>
+      <w:numFmt w:val="bullet"/>
+      <w:lvlText w:val="■"/>
+      <w:lvlJc w:val="left"/>
+      <w:pPr>
+        <w:ind w:left="4320" w:hanging="360"/>
+      </w:pPr>
+      <w:rPr>
+        <w:u w:val="none"/>
+      </w:rPr>
+    </w:lvl>
+    <w:lvl w:ilvl="6">
+      <w:start w:val="1"/>
+      <w:numFmt w:val="bullet"/>
+      <w:lvlText w:val="●"/>
+      <w:lvlJc w:val="left"/>
+      <w:pPr>
+        <w:ind w:left="5040" w:hanging="360"/>
+      </w:pPr>
+      <w:rPr>
+        <w:u w:val="none"/>
+      </w:rPr>
+    </w:lvl>
+    <w:lvl w:ilvl="7">
+      <w:start w:val="1"/>
+      <w:numFmt w:val="bullet"/>
+      <w:lvlText w:val="○"/>
+      <w:lvlJc w:val="left"/>
+      <w:pPr>
+        <w:ind w:left="5760" w:hanging="360"/>
+      </w:pPr>
+      <w:rPr>
+        <w:u w:val="none"/>
+      </w:rPr>
+    </w:lvl>
+    <w:lvl w:ilvl="8">
+      <w:start w:val="1"/>
+      <w:numFmt w:val="bullet"/>
+      <w:lvlText w:val="■"/>
+      <w:lvlJc w:val="left"/>
+      <w:pPr>
+        <w:ind w:left="6480" w:hanging="360"/>
+      </w:pPr>
+      <w:rPr>
+        <w:u w:val="none"/>
+      </w:rPr>
+    </w:lvl>
+  </w:abstractNum>
+  <w:abstractNum w:abstractNumId="13" w15:restartNumberingAfterBreak="0">
+    <w:nsid w:val="59E453CB"/>
+    <w:multiLevelType w:val="multilevel"/>
+    <w:tmpl w:val="94144D04"/>
+    <w:lvl w:ilvl="0">
+      <w:start w:val="1"/>
+      <w:numFmt w:val="decimal"/>
+      <w:lvlText w:val="%1."/>
+      <w:lvlJc w:val="left"/>
+      <w:pPr>
+        <w:ind w:left="720" w:hanging="360"/>
+      </w:pPr>
+      <w:rPr>
+        <w:u w:val="none"/>
+      </w:rPr>
+    </w:lvl>
+    <w:lvl w:ilvl="1">
+      <w:start w:val="1"/>
+      <w:numFmt w:val="lowerLetter"/>
+      <w:lvlText w:val="%2."/>
+      <w:lvlJc w:val="left"/>
+      <w:pPr>
+        <w:ind w:left="1440" w:hanging="360"/>
+      </w:pPr>
+      <w:rPr>
+        <w:u w:val="none"/>
+      </w:rPr>
+    </w:lvl>
+    <w:lvl w:ilvl="2">
+      <w:start w:val="1"/>
+      <w:numFmt w:val="lowerRoman"/>
+      <w:lvlText w:val="%3."/>
+      <w:lvlJc w:val="right"/>
+      <w:pPr>
+        <w:ind w:left="2160" w:hanging="360"/>
+      </w:pPr>
+      <w:rPr>
+        <w:u w:val="none"/>
+      </w:rPr>
+    </w:lvl>
+    <w:lvl w:ilvl="3">
+      <w:start w:val="1"/>
+      <w:numFmt w:val="decimal"/>
+      <w:lvlText w:val="%4."/>
+      <w:lvlJc w:val="left"/>
+      <w:pPr>
+        <w:ind w:left="2880" w:hanging="360"/>
+      </w:pPr>
+      <w:rPr>
+        <w:u w:val="none"/>
+      </w:rPr>
+    </w:lvl>
+    <w:lvl w:ilvl="4">
+      <w:start w:val="1"/>
+      <w:numFmt w:val="lowerLetter"/>
+      <w:lvlText w:val="%5."/>
+      <w:lvlJc w:val="left"/>
+      <w:pPr>
+        <w:ind w:left="3600" w:hanging="360"/>
+      </w:pPr>
+      <w:rPr>
+        <w:u w:val="none"/>
+      </w:rPr>
+    </w:lvl>
+    <w:lvl w:ilvl="5">
+      <w:start w:val="1"/>
+      <w:numFmt w:val="lowerRoman"/>
+      <w:lvlText w:val="%6."/>
+      <w:lvlJc w:val="right"/>
+      <w:pPr>
+        <w:ind w:left="4320" w:hanging="360"/>
+      </w:pPr>
+      <w:rPr>
+        <w:u w:val="none"/>
+      </w:rPr>
+    </w:lvl>
+    <w:lvl w:ilvl="6">
+      <w:start w:val="1"/>
+      <w:numFmt w:val="decimal"/>
+      <w:lvlText w:val="%7."/>
+      <w:lvlJc w:val="left"/>
+      <w:pPr>
+        <w:ind w:left="5040" w:hanging="360"/>
+      </w:pPr>
+      <w:rPr>
+        <w:u w:val="none"/>
+      </w:rPr>
+    </w:lvl>
+    <w:lvl w:ilvl="7">
+      <w:start w:val="1"/>
+      <w:numFmt w:val="lowerLetter"/>
+      <w:lvlText w:val="%8."/>
+      <w:lvlJc w:val="left"/>
+      <w:pPr>
+        <w:ind w:left="5760" w:hanging="360"/>
+      </w:pPr>
+      <w:rPr>
+        <w:u w:val="none"/>
+      </w:rPr>
+    </w:lvl>
+    <w:lvl w:ilvl="8">
+      <w:start w:val="1"/>
+      <w:numFmt w:val="lowerRoman"/>
+      <w:lvlText w:val="%9."/>
+      <w:lvlJc w:val="right"/>
+      <w:pPr>
+        <w:ind w:left="6480" w:hanging="360"/>
+      </w:pPr>
+      <w:rPr>
+        <w:u w:val="none"/>
+      </w:rPr>
+    </w:lvl>
+  </w:abstractNum>
+  <w:abstractNum w:abstractNumId="14" w15:restartNumberingAfterBreak="0">
+    <w:nsid w:val="647414C4"/>
+    <w:multiLevelType w:val="multilevel"/>
+    <w:tmpl w:val="B5F2BDA2"/>
+    <w:lvl w:ilvl="0">
+      <w:start w:val="1"/>
+      <w:numFmt w:val="bullet"/>
+      <w:lvlText w:val="●"/>
+      <w:lvlJc w:val="left"/>
+      <w:pPr>
+        <w:ind w:left="1440" w:hanging="360"/>
+      </w:pPr>
+      <w:rPr>
+        <w:u w:val="none"/>
+      </w:rPr>
+    </w:lvl>
+    <w:lvl w:ilvl="1">
+      <w:start w:val="1"/>
+      <w:numFmt w:val="bullet"/>
+      <w:lvlText w:val="○"/>
+      <w:lvlJc w:val="left"/>
+      <w:pPr>
+        <w:ind w:left="2160" w:hanging="360"/>
+      </w:pPr>
+      <w:rPr>
+        <w:u w:val="none"/>
+      </w:rPr>
+    </w:lvl>
+    <w:lvl w:ilvl="2">
+      <w:start w:val="1"/>
+      <w:numFmt w:val="bullet"/>
+      <w:lvlText w:val="■"/>
+      <w:lvlJc w:val="left"/>
+      <w:pPr>
+        <w:ind w:left="2880" w:hanging="360"/>
+      </w:pPr>
+      <w:rPr>
+        <w:u w:val="none"/>
+      </w:rPr>
+    </w:lvl>
+    <w:lvl w:ilvl="3">
+      <w:start w:val="1"/>
+      <w:numFmt w:val="bullet"/>
+      <w:lvlText w:val="●"/>
+      <w:lvlJc w:val="left"/>
+      <w:pPr>
+        <w:ind w:left="3600" w:hanging="360"/>
+      </w:pPr>
+      <w:rPr>
+        <w:u w:val="none"/>
+      </w:rPr>
+    </w:lvl>
+    <w:lvl w:ilvl="4">
+      <w:start w:val="1"/>
+      <w:numFmt w:val="bullet"/>
+      <w:lvlText w:val="○"/>
+      <w:lvlJc w:val="left"/>
+      <w:pPr>
+        <w:ind w:left="4320" w:hanging="360"/>
+      </w:pPr>
+      <w:rPr>
+        <w:u w:val="none"/>
+      </w:rPr>
+    </w:lvl>
+    <w:lvl w:ilvl="5">
+      <w:start w:val="1"/>
+      <w:numFmt w:val="bullet"/>
+      <w:lvlText w:val="■"/>
+      <w:lvlJc w:val="left"/>
+      <w:pPr>
+        <w:ind w:left="5040" w:hanging="360"/>
+      </w:pPr>
+      <w:rPr>
+        <w:u w:val="none"/>
+      </w:rPr>
+    </w:lvl>
+    <w:lvl w:ilvl="6">
+      <w:start w:val="1"/>
+      <w:numFmt w:val="bullet"/>
+      <w:lvlText w:val="●"/>
+      <w:lvlJc w:val="left"/>
+      <w:pPr>
+        <w:ind w:left="5760" w:hanging="360"/>
+      </w:pPr>
+      <w:rPr>
+        <w:u w:val="none"/>
+      </w:rPr>
+    </w:lvl>
+    <w:lvl w:ilvl="7">
+      <w:start w:val="1"/>
+      <w:numFmt w:val="bullet"/>
+      <w:lvlText w:val="○"/>
+      <w:lvlJc w:val="left"/>
+      <w:pPr>
+        <w:ind w:left="6480" w:hanging="360"/>
+      </w:pPr>
+      <w:rPr>
+        <w:u w:val="none"/>
+      </w:rPr>
+    </w:lvl>
+    <w:lvl w:ilvl="8">
+      <w:start w:val="1"/>
+      <w:numFmt w:val="bullet"/>
+      <w:lvlText w:val="■"/>
+      <w:lvlJc w:val="left"/>
+      <w:pPr>
+        <w:ind w:left="7200" w:hanging="360"/>
+      </w:pPr>
+      <w:rPr>
+        <w:u w:val="none"/>
+      </w:rPr>
+    </w:lvl>
+  </w:abstractNum>
+  <w:abstractNum w:abstractNumId="15" w15:restartNumberingAfterBreak="0">
+    <w:nsid w:val="6C1363D1"/>
+    <w:multiLevelType w:val="multilevel"/>
+    <w:tmpl w:val="1BEA2DE2"/>
+    <w:lvl w:ilvl="0">
+      <w:start w:val="1"/>
+      <w:numFmt w:val="bullet"/>
+      <w:lvlText w:val="●"/>
+      <w:lvlJc w:val="left"/>
+      <w:pPr>
+        <w:ind w:left="720" w:hanging="360"/>
+      </w:pPr>
+      <w:rPr>
+        <w:rFonts w:ascii="Arial" w:eastAsia="Arial" w:hAnsi="Arial" w:cs="Arial"/>
+        <w:b w:val="0"/>
+        <w:bCs w:val="0"/>
+        <w:i w:val="0"/>
+        <w:iCs w:val="0"/>
+        <w:smallCaps w:val="0"/>
+        <w:color w:val="CBCEBC"/>
+        <w:sz w:val="21"/>
+        <w:szCs w:val="21"/>
+        <w:u w:val="none"/>
+      </w:rPr>
+    </w:lvl>
+    <w:lvl w:ilvl="1">
+      <w:start w:val="1"/>
+      <w:numFmt w:val="bullet"/>
+      <w:lvlText w:val="○"/>
+      <w:lvlJc w:val="left"/>
+      <w:pPr>
+        <w:ind w:left="1440" w:hanging="360"/>
+      </w:pPr>
+      <w:rPr>
+        <w:rFonts w:ascii="Arial" w:eastAsia="Arial" w:hAnsi="Arial" w:cs="Arial"/>
+        <w:b w:val="0"/>
+        <w:bCs w:val="0"/>
+        <w:i w:val="0"/>
+        <w:iCs w:val="0"/>
+        <w:smallCaps w:val="0"/>
+        <w:color w:val="CBCEBC"/>
+        <w:sz w:val="21"/>
+        <w:szCs w:val="21"/>
+        <w:u w:val="none"/>
+      </w:rPr>
+    </w:lvl>
+    <w:lvl w:ilvl="2">
+      <w:start w:val="1"/>
+      <w:numFmt w:val="bullet"/>
+      <w:lvlText w:val="■"/>
+      <w:lvlJc w:val="left"/>
+      <w:pPr>
+        <w:ind w:left="2160" w:hanging="360"/>
+      </w:pPr>
+      <w:rPr>
+        <w:u w:val="none"/>
+      </w:rPr>
+    </w:lvl>
+    <w:lvl w:ilvl="3">
+      <w:start w:val="1"/>
+      <w:numFmt w:val="bullet"/>
+      <w:lvlText w:val="●"/>
+      <w:lvlJc w:val="left"/>
+      <w:pPr>
+        <w:ind w:left="2880" w:hanging="360"/>
+      </w:pPr>
+      <w:rPr>
+        <w:u w:val="none"/>
+      </w:rPr>
+    </w:lvl>
+    <w:lvl w:ilvl="4">
+      <w:start w:val="1"/>
+      <w:numFmt w:val="bullet"/>
+      <w:lvlText w:val="○"/>
+      <w:lvlJc w:val="left"/>
+      <w:pPr>
+        <w:ind w:left="3600" w:hanging="360"/>
+      </w:pPr>
+      <w:rPr>
+        <w:u w:val="none"/>
+      </w:rPr>
+    </w:lvl>
+    <w:lvl w:ilvl="5">
+      <w:start w:val="1"/>
+      <w:numFmt w:val="bullet"/>
+      <w:lvlText w:val="■"/>
+      <w:lvlJc w:val="left"/>
+      <w:pPr>
+        <w:ind w:left="4320" w:hanging="360"/>
+      </w:pPr>
+      <w:rPr>
+        <w:u w:val="none"/>
+      </w:rPr>
+    </w:lvl>
+    <w:lvl w:ilvl="6">
+      <w:start w:val="1"/>
+      <w:numFmt w:val="bullet"/>
+      <w:lvlText w:val="●"/>
+      <w:lvlJc w:val="left"/>
+      <w:pPr>
+        <w:ind w:left="5040" w:hanging="360"/>
+      </w:pPr>
+      <w:rPr>
+        <w:u w:val="none"/>
+      </w:rPr>
+    </w:lvl>
+    <w:lvl w:ilvl="7">
+      <w:start w:val="1"/>
+      <w:numFmt w:val="bullet"/>
+      <w:lvlText w:val="○"/>
+      <w:lvlJc w:val="left"/>
+      <w:pPr>
+        <w:ind w:left="5760" w:hanging="360"/>
+      </w:pPr>
+      <w:rPr>
+        <w:u w:val="none"/>
+      </w:rPr>
+    </w:lvl>
+    <w:lvl w:ilvl="8">
+      <w:start w:val="1"/>
+      <w:numFmt w:val="bullet"/>
+      <w:lvlText w:val="■"/>
+      <w:lvlJc w:val="left"/>
+      <w:pPr>
+        <w:ind w:left="6480" w:hanging="360"/>
+      </w:pPr>
+      <w:rPr>
+        <w:u w:val="none"/>
+      </w:rPr>
+    </w:lvl>
+  </w:abstractNum>
+  <w:abstractNum w:abstractNumId="16" w15:restartNumberingAfterBreak="0">
+    <w:nsid w:val="6CC91E02"/>
+    <w:multiLevelType w:val="multilevel"/>
+    <w:tmpl w:val="B94C114C"/>
+    <w:lvl w:ilvl="0">
+      <w:start w:val="1"/>
+      <w:numFmt w:val="decimal"/>
+      <w:lvlText w:val="%1."/>
+      <w:lvlJc w:val="left"/>
+      <w:pPr>
+        <w:ind w:left="720" w:hanging="360"/>
+      </w:pPr>
+      <w:rPr>
+        <w:u w:val="none"/>
+      </w:rPr>
+    </w:lvl>
+    <w:lvl w:ilvl="1">
+      <w:start w:val="1"/>
+      <w:numFmt w:val="lowerLetter"/>
+      <w:lvlText w:val="%2."/>
+      <w:lvlJc w:val="left"/>
+      <w:pPr>
+        <w:ind w:left="1440" w:hanging="360"/>
+      </w:pPr>
+      <w:rPr>
+        <w:u w:val="none"/>
+      </w:rPr>
+    </w:lvl>
+    <w:lvl w:ilvl="2">
+      <w:start w:val="1"/>
+      <w:numFmt w:val="lowerRoman"/>
+      <w:lvlText w:val="%3."/>
+      <w:lvlJc w:val="right"/>
+      <w:pPr>
+        <w:ind w:left="2160" w:hanging="360"/>
+      </w:pPr>
+      <w:rPr>
+        <w:u w:val="none"/>
+      </w:rPr>
+    </w:lvl>
+    <w:lvl w:ilvl="3">
+      <w:start w:val="1"/>
+      <w:numFmt w:val="decimal"/>
+      <w:lvlText w:val="%4."/>
+      <w:lvlJc w:val="left"/>
+      <w:pPr>
+        <w:ind w:left="2880" w:hanging="360"/>
+      </w:pPr>
+      <w:rPr>
+        <w:u w:val="none"/>
+      </w:rPr>
+    </w:lvl>
+    <w:lvl w:ilvl="4">
+      <w:start w:val="1"/>
+      <w:numFmt w:val="lowerLetter"/>
+      <w:lvlText w:val="%5."/>
+      <w:lvlJc w:val="left"/>
+      <w:pPr>
+        <w:ind w:left="3600" w:hanging="360"/>
+      </w:pPr>
+      <w:rPr>
+        <w:u w:val="none"/>
+      </w:rPr>
+    </w:lvl>
+    <w:lvl w:ilvl="5">
+      <w:start w:val="1"/>
+      <w:numFmt w:val="lowerRoman"/>
+      <w:lvlText w:val="%6."/>
+      <w:lvlJc w:val="right"/>
+      <w:pPr>
+        <w:ind w:left="4320" w:hanging="360"/>
+      </w:pPr>
+      <w:rPr>
+        <w:u w:val="none"/>
+      </w:rPr>
+    </w:lvl>
+    <w:lvl w:ilvl="6">
+      <w:start w:val="1"/>
+      <w:numFmt w:val="decimal"/>
+      <w:lvlText w:val="%7."/>
+      <w:lvlJc w:val="left"/>
+      <w:pPr>
+        <w:ind w:left="5040" w:hanging="360"/>
+      </w:pPr>
+      <w:rPr>
+        <w:u w:val="none"/>
+      </w:rPr>
+    </w:lvl>
+    <w:lvl w:ilvl="7">
+      <w:start w:val="1"/>
+      <w:numFmt w:val="lowerLetter"/>
+      <w:lvlText w:val="%8."/>
+      <w:lvlJc w:val="left"/>
+      <w:pPr>
+        <w:ind w:left="5760" w:hanging="360"/>
+      </w:pPr>
+      <w:rPr>
+        <w:u w:val="none"/>
+      </w:rPr>
+    </w:lvl>
+    <w:lvl w:ilvl="8">
+      <w:start w:val="1"/>
+      <w:numFmt w:val="lowerRoman"/>
+      <w:lvlText w:val="%9."/>
+      <w:lvlJc w:val="right"/>
+      <w:pPr>
+        <w:ind w:left="6480" w:hanging="360"/>
+      </w:pPr>
+      <w:rPr>
+        <w:u w:val="none"/>
+      </w:rPr>
+    </w:lvl>
+  </w:abstractNum>
+  <w:abstractNum w:abstractNumId="17" w15:restartNumberingAfterBreak="0">
+    <w:nsid w:val="7CEA648E"/>
+    <w:multiLevelType w:val="multilevel"/>
+    <w:tmpl w:val="E2325802"/>
+    <w:lvl w:ilvl="0">
+      <w:start w:val="1"/>
+      <w:numFmt w:val="bullet"/>
+      <w:lvlText w:val="●"/>
+      <w:lvlJc w:val="left"/>
+      <w:pPr>
+        <w:ind w:left="720" w:hanging="360"/>
+      </w:pPr>
+      <w:rPr>
+        <w:rFonts w:ascii="Arial" w:eastAsia="Arial" w:hAnsi="Arial" w:cs="Arial"/>
+        <w:b w:val="0"/>
+        <w:bCs w:val="0"/>
+        <w:i w:val="0"/>
+        <w:iCs w:val="0"/>
+        <w:smallCaps w:val="0"/>
+        <w:color w:val="CBCEBC"/>
+        <w:sz w:val="21"/>
+        <w:szCs w:val="21"/>
+        <w:u w:val="none"/>
+      </w:rPr>
+    </w:lvl>
+    <w:lvl w:ilvl="1">
+      <w:start w:val="1"/>
       <w:numFmt w:val="decimal"/>
       <w:lvlText w:val="%2."/>
       <w:lvlJc w:val="left"/>
@@ -8211,254 +8982,10 @@
       </w:rPr>
     </w:lvl>
   </w:abstractNum>
-  <w:abstractNum w:abstractNumId="12" w15:restartNumberingAfterBreak="0">
-    <w:nsid w:val="5ECE4374"/>
+  <w:abstractNum w:abstractNumId="18" w15:restartNumberingAfterBreak="0">
+    <w:nsid w:val="7CED5603"/>
     <w:multiLevelType w:val="multilevel"/>
-    <w:tmpl w:val="D2441902"/>
-    <w:lvl w:ilvl="0">
-      <w:start w:val="1"/>
-      <w:numFmt w:val="bullet"/>
-      <w:lvlText w:val="●"/>
-      <w:lvlJc w:val="left"/>
-      <w:pPr>
-        <w:ind w:left="1440" w:hanging="360"/>
-      </w:pPr>
-      <w:rPr>
-        <w:u w:val="none"/>
-      </w:rPr>
-    </w:lvl>
-    <w:lvl w:ilvl="1">
-      <w:start w:val="1"/>
-      <w:numFmt w:val="bullet"/>
-      <w:lvlText w:val="○"/>
-      <w:lvlJc w:val="left"/>
-      <w:pPr>
-        <w:ind w:left="2160" w:hanging="360"/>
-      </w:pPr>
-      <w:rPr>
-        <w:u w:val="none"/>
-      </w:rPr>
-    </w:lvl>
-    <w:lvl w:ilvl="2">
-      <w:start w:val="1"/>
-      <w:numFmt w:val="bullet"/>
-      <w:lvlText w:val="■"/>
-      <w:lvlJc w:val="left"/>
-      <w:pPr>
-        <w:ind w:left="2880" w:hanging="360"/>
-      </w:pPr>
-      <w:rPr>
-        <w:u w:val="none"/>
-      </w:rPr>
-    </w:lvl>
-    <w:lvl w:ilvl="3">
-      <w:start w:val="1"/>
-      <w:numFmt w:val="bullet"/>
-      <w:lvlText w:val="●"/>
-      <w:lvlJc w:val="left"/>
-      <w:pPr>
-        <w:ind w:left="3600" w:hanging="360"/>
-      </w:pPr>
-      <w:rPr>
-        <w:u w:val="none"/>
-      </w:rPr>
-    </w:lvl>
-    <w:lvl w:ilvl="4">
-      <w:start w:val="1"/>
-      <w:numFmt w:val="bullet"/>
-      <w:lvlText w:val="○"/>
-      <w:lvlJc w:val="left"/>
-      <w:pPr>
-        <w:ind w:left="4320" w:hanging="360"/>
-      </w:pPr>
-      <w:rPr>
-        <w:u w:val="none"/>
-      </w:rPr>
-    </w:lvl>
-    <w:lvl w:ilvl="5">
-      <w:start w:val="1"/>
-      <w:numFmt w:val="bullet"/>
-      <w:lvlText w:val="■"/>
-      <w:lvlJc w:val="left"/>
-      <w:pPr>
-        <w:ind w:left="5040" w:hanging="360"/>
-      </w:pPr>
-      <w:rPr>
-        <w:u w:val="none"/>
-      </w:rPr>
-    </w:lvl>
-    <w:lvl w:ilvl="6">
-      <w:start w:val="1"/>
-      <w:numFmt w:val="bullet"/>
-      <w:lvlText w:val="●"/>
-      <w:lvlJc w:val="left"/>
-      <w:pPr>
-        <w:ind w:left="5760" w:hanging="360"/>
-      </w:pPr>
-      <w:rPr>
-        <w:u w:val="none"/>
-      </w:rPr>
-    </w:lvl>
-    <w:lvl w:ilvl="7">
-      <w:start w:val="1"/>
-      <w:numFmt w:val="bullet"/>
-      <w:lvlText w:val="○"/>
-      <w:lvlJc w:val="left"/>
-      <w:pPr>
-        <w:ind w:left="6480" w:hanging="360"/>
-      </w:pPr>
-      <w:rPr>
-        <w:u w:val="none"/>
-      </w:rPr>
-    </w:lvl>
-    <w:lvl w:ilvl="8">
-      <w:start w:val="1"/>
-      <w:numFmt w:val="bullet"/>
-      <w:lvlText w:val="■"/>
-      <w:lvlJc w:val="left"/>
-      <w:pPr>
-        <w:ind w:left="7200" w:hanging="360"/>
-      </w:pPr>
-      <w:rPr>
-        <w:u w:val="none"/>
-      </w:rPr>
-    </w:lvl>
-  </w:abstractNum>
-  <w:abstractNum w:abstractNumId="13" w15:restartNumberingAfterBreak="0">
-    <w:nsid w:val="61CD2E35"/>
-    <w:multiLevelType w:val="multilevel"/>
-    <w:tmpl w:val="E5EC0E82"/>
-    <w:lvl w:ilvl="0">
-      <w:start w:val="1"/>
-      <w:numFmt w:val="decimal"/>
-      <w:lvlText w:val="%1."/>
-      <w:lvlJc w:val="left"/>
-      <w:pPr>
-        <w:ind w:left="720" w:hanging="360"/>
-      </w:pPr>
-      <w:rPr>
-        <w:rFonts w:ascii="Arial" w:eastAsia="Arial" w:hAnsi="Arial" w:cs="Arial"/>
-        <w:b w:val="0"/>
-        <w:bCs w:val="0"/>
-        <w:i w:val="0"/>
-        <w:iCs w:val="0"/>
-        <w:smallCaps w:val="0"/>
-        <w:color w:val="CBCEBC"/>
-        <w:sz w:val="21"/>
-        <w:szCs w:val="21"/>
-        <w:u w:val="none"/>
-      </w:rPr>
-    </w:lvl>
-    <w:lvl w:ilvl="1">
-      <w:start w:val="1"/>
-      <w:numFmt w:val="bullet"/>
-      <w:lvlText w:val="○"/>
-      <w:lvlJc w:val="left"/>
-      <w:pPr>
-        <w:ind w:left="1440" w:hanging="360"/>
-      </w:pPr>
-      <w:rPr>
-        <w:rFonts w:ascii="Arial" w:eastAsia="Arial" w:hAnsi="Arial" w:cs="Arial"/>
-        <w:b w:val="0"/>
-        <w:bCs w:val="0"/>
-        <w:i w:val="0"/>
-        <w:iCs w:val="0"/>
-        <w:smallCaps w:val="0"/>
-        <w:color w:val="CBCEBC"/>
-        <w:sz w:val="21"/>
-        <w:szCs w:val="21"/>
-        <w:u w:val="none"/>
-      </w:rPr>
-    </w:lvl>
-    <w:lvl w:ilvl="2">
-      <w:start w:val="1"/>
-      <w:numFmt w:val="lowerRoman"/>
-      <w:lvlText w:val="%3."/>
-      <w:lvlJc w:val="left"/>
-      <w:pPr>
-        <w:ind w:left="2160" w:hanging="360"/>
-      </w:pPr>
-      <w:rPr>
-        <w:u w:val="none"/>
-      </w:rPr>
-    </w:lvl>
-    <w:lvl w:ilvl="3">
-      <w:start w:val="1"/>
-      <w:numFmt w:val="decimal"/>
-      <w:lvlText w:val="%4."/>
-      <w:lvlJc w:val="left"/>
-      <w:pPr>
-        <w:ind w:left="2880" w:hanging="360"/>
-      </w:pPr>
-      <w:rPr>
-        <w:u w:val="none"/>
-      </w:rPr>
-    </w:lvl>
-    <w:lvl w:ilvl="4">
-      <w:start w:val="1"/>
-      <w:numFmt w:val="lowerLetter"/>
-      <w:lvlText w:val="%5."/>
-      <w:lvlJc w:val="left"/>
-      <w:pPr>
-        <w:ind w:left="3600" w:hanging="360"/>
-      </w:pPr>
-      <w:rPr>
-        <w:u w:val="none"/>
-      </w:rPr>
-    </w:lvl>
-    <w:lvl w:ilvl="5">
-      <w:start w:val="1"/>
-      <w:numFmt w:val="lowerRoman"/>
-      <w:lvlText w:val="%6."/>
-      <w:lvlJc w:val="left"/>
-      <w:pPr>
-        <w:ind w:left="4320" w:hanging="360"/>
-      </w:pPr>
-      <w:rPr>
-        <w:u w:val="none"/>
-      </w:rPr>
-    </w:lvl>
-    <w:lvl w:ilvl="6">
-      <w:start w:val="1"/>
-      <w:numFmt w:val="decimal"/>
-      <w:lvlText w:val="%7."/>
-      <w:lvlJc w:val="left"/>
-      <w:pPr>
-        <w:ind w:left="5040" w:hanging="360"/>
-      </w:pPr>
-      <w:rPr>
-        <w:u w:val="none"/>
-      </w:rPr>
-    </w:lvl>
-    <w:lvl w:ilvl="7">
-      <w:start w:val="1"/>
-      <w:numFmt w:val="lowerLetter"/>
-      <w:lvlText w:val="%8."/>
-      <w:lvlJc w:val="left"/>
-      <w:pPr>
-        <w:ind w:left="5760" w:hanging="360"/>
-      </w:pPr>
-      <w:rPr>
-        <w:u w:val="none"/>
-      </w:rPr>
-    </w:lvl>
-    <w:lvl w:ilvl="8">
-      <w:start w:val="1"/>
-      <w:numFmt w:val="lowerRoman"/>
-      <w:lvlText w:val="%9."/>
-      <w:lvlJc w:val="left"/>
-      <w:pPr>
-        <w:ind w:left="6480" w:hanging="360"/>
-      </w:pPr>
-      <w:rPr>
-        <w:u w:val="none"/>
-      </w:rPr>
-    </w:lvl>
-  </w:abstractNum>
-  <w:abstractNum w:abstractNumId="14" w15:restartNumberingAfterBreak="0">
-    <w:nsid w:val="717B501C"/>
-    <w:multiLevelType w:val="multilevel"/>
-    <w:tmpl w:val="35B490CC"/>
+    <w:tmpl w:val="F5E017F0"/>
     <w:lvl w:ilvl="0">
       <w:start w:val="1"/>
       <w:numFmt w:val="decimal"/>
@@ -8568,532 +9095,62 @@
       </w:rPr>
     </w:lvl>
   </w:abstractNum>
-  <w:abstractNum w:abstractNumId="15" w15:restartNumberingAfterBreak="0">
-    <w:nsid w:val="73EA3309"/>
-    <w:multiLevelType w:val="multilevel"/>
-    <w:tmpl w:val="41C21B12"/>
-    <w:lvl w:ilvl="0">
-      <w:start w:val="1"/>
-      <w:numFmt w:val="bullet"/>
-      <w:lvlText w:val="●"/>
-      <w:lvlJc w:val="left"/>
-      <w:pPr>
-        <w:ind w:left="720" w:hanging="360"/>
-      </w:pPr>
-      <w:rPr>
-        <w:rFonts w:ascii="Arial" w:eastAsia="Arial" w:hAnsi="Arial" w:cs="Arial"/>
-        <w:b w:val="0"/>
-        <w:bCs w:val="0"/>
-        <w:i w:val="0"/>
-        <w:iCs w:val="0"/>
-        <w:smallCaps w:val="0"/>
-        <w:color w:val="CBCEBC"/>
-        <w:sz w:val="21"/>
-        <w:szCs w:val="21"/>
-        <w:u w:val="none"/>
-      </w:rPr>
-    </w:lvl>
-    <w:lvl w:ilvl="1">
-      <w:start w:val="1"/>
-      <w:numFmt w:val="bullet"/>
-      <w:lvlText w:val="○"/>
-      <w:lvlJc w:val="left"/>
-      <w:pPr>
-        <w:ind w:left="1440" w:hanging="360"/>
-      </w:pPr>
-      <w:rPr>
-        <w:rFonts w:ascii="Arial" w:eastAsia="Arial" w:hAnsi="Arial" w:cs="Arial"/>
-        <w:b w:val="0"/>
-        <w:bCs w:val="0"/>
-        <w:i w:val="0"/>
-        <w:iCs w:val="0"/>
-        <w:smallCaps w:val="0"/>
-        <w:color w:val="CBCEBC"/>
-        <w:sz w:val="21"/>
-        <w:szCs w:val="21"/>
-        <w:u w:val="none"/>
-      </w:rPr>
-    </w:lvl>
-    <w:lvl w:ilvl="2">
-      <w:start w:val="1"/>
-      <w:numFmt w:val="bullet"/>
-      <w:lvlText w:val="■"/>
-      <w:lvlJc w:val="left"/>
-      <w:pPr>
-        <w:ind w:left="2160" w:hanging="360"/>
-      </w:pPr>
-      <w:rPr>
-        <w:u w:val="none"/>
-      </w:rPr>
-    </w:lvl>
-    <w:lvl w:ilvl="3">
-      <w:start w:val="1"/>
-      <w:numFmt w:val="bullet"/>
-      <w:lvlText w:val="●"/>
-      <w:lvlJc w:val="left"/>
-      <w:pPr>
-        <w:ind w:left="2880" w:hanging="360"/>
-      </w:pPr>
-      <w:rPr>
-        <w:u w:val="none"/>
-      </w:rPr>
-    </w:lvl>
-    <w:lvl w:ilvl="4">
-      <w:start w:val="1"/>
-      <w:numFmt w:val="bullet"/>
-      <w:lvlText w:val="○"/>
-      <w:lvlJc w:val="left"/>
-      <w:pPr>
-        <w:ind w:left="3600" w:hanging="360"/>
-      </w:pPr>
-      <w:rPr>
-        <w:u w:val="none"/>
-      </w:rPr>
-    </w:lvl>
-    <w:lvl w:ilvl="5">
-      <w:start w:val="1"/>
-      <w:numFmt w:val="bullet"/>
-      <w:lvlText w:val="■"/>
-      <w:lvlJc w:val="left"/>
-      <w:pPr>
-        <w:ind w:left="4320" w:hanging="360"/>
-      </w:pPr>
-      <w:rPr>
-        <w:u w:val="none"/>
-      </w:rPr>
-    </w:lvl>
-    <w:lvl w:ilvl="6">
-      <w:start w:val="1"/>
-      <w:numFmt w:val="bullet"/>
-      <w:lvlText w:val="●"/>
-      <w:lvlJc w:val="left"/>
-      <w:pPr>
-        <w:ind w:left="5040" w:hanging="360"/>
-      </w:pPr>
-      <w:rPr>
-        <w:u w:val="none"/>
-      </w:rPr>
-    </w:lvl>
-    <w:lvl w:ilvl="7">
-      <w:start w:val="1"/>
-      <w:numFmt w:val="bullet"/>
-      <w:lvlText w:val="○"/>
-      <w:lvlJc w:val="left"/>
-      <w:pPr>
-        <w:ind w:left="5760" w:hanging="360"/>
-      </w:pPr>
-      <w:rPr>
-        <w:u w:val="none"/>
-      </w:rPr>
-    </w:lvl>
-    <w:lvl w:ilvl="8">
-      <w:start w:val="1"/>
-      <w:numFmt w:val="bullet"/>
-      <w:lvlText w:val="■"/>
-      <w:lvlJc w:val="left"/>
-      <w:pPr>
-        <w:ind w:left="6480" w:hanging="360"/>
-      </w:pPr>
-      <w:rPr>
-        <w:u w:val="none"/>
-      </w:rPr>
-    </w:lvl>
-  </w:abstractNum>
-  <w:abstractNum w:abstractNumId="16" w15:restartNumberingAfterBreak="0">
-    <w:nsid w:val="7AF25F32"/>
-    <w:multiLevelType w:val="multilevel"/>
-    <w:tmpl w:val="B820236C"/>
-    <w:lvl w:ilvl="0">
-      <w:start w:val="1"/>
-      <w:numFmt w:val="decimal"/>
-      <w:lvlText w:val="%1."/>
-      <w:lvlJc w:val="left"/>
-      <w:pPr>
-        <w:ind w:left="720" w:hanging="360"/>
-      </w:pPr>
-      <w:rPr>
-        <w:u w:val="none"/>
-      </w:rPr>
-    </w:lvl>
-    <w:lvl w:ilvl="1">
-      <w:start w:val="1"/>
-      <w:numFmt w:val="lowerLetter"/>
-      <w:lvlText w:val="%2."/>
-      <w:lvlJc w:val="left"/>
-      <w:pPr>
-        <w:ind w:left="1440" w:hanging="360"/>
-      </w:pPr>
-      <w:rPr>
-        <w:u w:val="none"/>
-      </w:rPr>
-    </w:lvl>
-    <w:lvl w:ilvl="2">
-      <w:start w:val="1"/>
-      <w:numFmt w:val="lowerRoman"/>
-      <w:lvlText w:val="%3."/>
-      <w:lvlJc w:val="right"/>
-      <w:pPr>
-        <w:ind w:left="2160" w:hanging="360"/>
-      </w:pPr>
-      <w:rPr>
-        <w:u w:val="none"/>
-      </w:rPr>
-    </w:lvl>
-    <w:lvl w:ilvl="3">
-      <w:start w:val="1"/>
-      <w:numFmt w:val="decimal"/>
-      <w:lvlText w:val="%4."/>
-      <w:lvlJc w:val="left"/>
-      <w:pPr>
-        <w:ind w:left="2880" w:hanging="360"/>
-      </w:pPr>
-      <w:rPr>
-        <w:u w:val="none"/>
-      </w:rPr>
-    </w:lvl>
-    <w:lvl w:ilvl="4">
-      <w:start w:val="1"/>
-      <w:numFmt w:val="lowerLetter"/>
-      <w:lvlText w:val="%5."/>
-      <w:lvlJc w:val="left"/>
-      <w:pPr>
-        <w:ind w:left="3600" w:hanging="360"/>
-      </w:pPr>
-      <w:rPr>
-        <w:u w:val="none"/>
-      </w:rPr>
-    </w:lvl>
-    <w:lvl w:ilvl="5">
-      <w:start w:val="1"/>
-      <w:numFmt w:val="lowerRoman"/>
-      <w:lvlText w:val="%6."/>
-      <w:lvlJc w:val="right"/>
-      <w:pPr>
-        <w:ind w:left="4320" w:hanging="360"/>
-      </w:pPr>
-      <w:rPr>
-        <w:u w:val="none"/>
-      </w:rPr>
-    </w:lvl>
-    <w:lvl w:ilvl="6">
-      <w:start w:val="1"/>
-      <w:numFmt w:val="decimal"/>
-      <w:lvlText w:val="%7."/>
-      <w:lvlJc w:val="left"/>
-      <w:pPr>
-        <w:ind w:left="5040" w:hanging="360"/>
-      </w:pPr>
-      <w:rPr>
-        <w:u w:val="none"/>
-      </w:rPr>
-    </w:lvl>
-    <w:lvl w:ilvl="7">
-      <w:start w:val="1"/>
-      <w:numFmt w:val="lowerLetter"/>
-      <w:lvlText w:val="%8."/>
-      <w:lvlJc w:val="left"/>
-      <w:pPr>
-        <w:ind w:left="5760" w:hanging="360"/>
-      </w:pPr>
-      <w:rPr>
-        <w:u w:val="none"/>
-      </w:rPr>
-    </w:lvl>
-    <w:lvl w:ilvl="8">
-      <w:start w:val="1"/>
-      <w:numFmt w:val="lowerRoman"/>
-      <w:lvlText w:val="%9."/>
-      <w:lvlJc w:val="right"/>
-      <w:pPr>
-        <w:ind w:left="6480" w:hanging="360"/>
-      </w:pPr>
-      <w:rPr>
-        <w:u w:val="none"/>
-      </w:rPr>
-    </w:lvl>
-  </w:abstractNum>
-  <w:abstractNum w:abstractNumId="17" w15:restartNumberingAfterBreak="0">
-    <w:nsid w:val="7D4A5298"/>
-    <w:multiLevelType w:val="multilevel"/>
-    <w:tmpl w:val="91F02FCC"/>
-    <w:lvl w:ilvl="0">
-      <w:start w:val="1"/>
-      <w:numFmt w:val="decimal"/>
-      <w:lvlText w:val="%1."/>
-      <w:lvlJc w:val="left"/>
-      <w:pPr>
-        <w:ind w:left="720" w:hanging="360"/>
-      </w:pPr>
-      <w:rPr>
-        <w:u w:val="none"/>
-      </w:rPr>
-    </w:lvl>
-    <w:lvl w:ilvl="1">
-      <w:start w:val="1"/>
-      <w:numFmt w:val="lowerLetter"/>
-      <w:lvlText w:val="%2."/>
-      <w:lvlJc w:val="left"/>
-      <w:pPr>
-        <w:ind w:left="1440" w:hanging="360"/>
-      </w:pPr>
-      <w:rPr>
-        <w:u w:val="none"/>
-      </w:rPr>
-    </w:lvl>
-    <w:lvl w:ilvl="2">
-      <w:start w:val="1"/>
-      <w:numFmt w:val="lowerRoman"/>
-      <w:lvlText w:val="%3."/>
-      <w:lvlJc w:val="right"/>
-      <w:pPr>
-        <w:ind w:left="2160" w:hanging="360"/>
-      </w:pPr>
-      <w:rPr>
-        <w:u w:val="none"/>
-      </w:rPr>
-    </w:lvl>
-    <w:lvl w:ilvl="3">
-      <w:start w:val="1"/>
-      <w:numFmt w:val="decimal"/>
-      <w:lvlText w:val="%4."/>
-      <w:lvlJc w:val="left"/>
-      <w:pPr>
-        <w:ind w:left="2880" w:hanging="360"/>
-      </w:pPr>
-      <w:rPr>
-        <w:u w:val="none"/>
-      </w:rPr>
-    </w:lvl>
-    <w:lvl w:ilvl="4">
-      <w:start w:val="1"/>
-      <w:numFmt w:val="lowerLetter"/>
-      <w:lvlText w:val="%5."/>
-      <w:lvlJc w:val="left"/>
-      <w:pPr>
-        <w:ind w:left="3600" w:hanging="360"/>
-      </w:pPr>
-      <w:rPr>
-        <w:u w:val="none"/>
-      </w:rPr>
-    </w:lvl>
-    <w:lvl w:ilvl="5">
-      <w:start w:val="1"/>
-      <w:numFmt w:val="lowerRoman"/>
-      <w:lvlText w:val="%6."/>
-      <w:lvlJc w:val="right"/>
-      <w:pPr>
-        <w:ind w:left="4320" w:hanging="360"/>
-      </w:pPr>
-      <w:rPr>
-        <w:u w:val="none"/>
-      </w:rPr>
-    </w:lvl>
-    <w:lvl w:ilvl="6">
-      <w:start w:val="1"/>
-      <w:numFmt w:val="decimal"/>
-      <w:lvlText w:val="%7."/>
-      <w:lvlJc w:val="left"/>
-      <w:pPr>
-        <w:ind w:left="5040" w:hanging="360"/>
-      </w:pPr>
-      <w:rPr>
-        <w:u w:val="none"/>
-      </w:rPr>
-    </w:lvl>
-    <w:lvl w:ilvl="7">
-      <w:start w:val="1"/>
-      <w:numFmt w:val="lowerLetter"/>
-      <w:lvlText w:val="%8."/>
-      <w:lvlJc w:val="left"/>
-      <w:pPr>
-        <w:ind w:left="5760" w:hanging="360"/>
-      </w:pPr>
-      <w:rPr>
-        <w:u w:val="none"/>
-      </w:rPr>
-    </w:lvl>
-    <w:lvl w:ilvl="8">
-      <w:start w:val="1"/>
-      <w:numFmt w:val="lowerRoman"/>
-      <w:lvlText w:val="%9."/>
-      <w:lvlJc w:val="right"/>
-      <w:pPr>
-        <w:ind w:left="6480" w:hanging="360"/>
-      </w:pPr>
-      <w:rPr>
-        <w:u w:val="none"/>
-      </w:rPr>
-    </w:lvl>
-  </w:abstractNum>
-  <w:abstractNum w:abstractNumId="18" w15:restartNumberingAfterBreak="0">
-    <w:nsid w:val="7DB26E77"/>
-    <w:multiLevelType w:val="multilevel"/>
-    <w:tmpl w:val="2500E784"/>
-    <w:lvl w:ilvl="0">
-      <w:start w:val="1"/>
-      <w:numFmt w:val="upperLetter"/>
-      <w:lvlText w:val="%1."/>
-      <w:lvlJc w:val="left"/>
-      <w:pPr>
-        <w:ind w:left="720" w:hanging="360"/>
-      </w:pPr>
-      <w:rPr>
-        <w:u w:val="none"/>
-      </w:rPr>
-    </w:lvl>
-    <w:lvl w:ilvl="1">
-      <w:start w:val="1"/>
-      <w:numFmt w:val="lowerLetter"/>
-      <w:lvlText w:val="%2."/>
-      <w:lvlJc w:val="left"/>
-      <w:pPr>
-        <w:ind w:left="1440" w:hanging="360"/>
-      </w:pPr>
-      <w:rPr>
-        <w:u w:val="none"/>
-      </w:rPr>
-    </w:lvl>
-    <w:lvl w:ilvl="2">
-      <w:start w:val="1"/>
-      <w:numFmt w:val="lowerRoman"/>
-      <w:lvlText w:val="%3."/>
-      <w:lvlJc w:val="right"/>
-      <w:pPr>
-        <w:ind w:left="2160" w:hanging="360"/>
-      </w:pPr>
-      <w:rPr>
-        <w:u w:val="none"/>
-      </w:rPr>
-    </w:lvl>
-    <w:lvl w:ilvl="3">
-      <w:start w:val="1"/>
-      <w:numFmt w:val="decimal"/>
-      <w:lvlText w:val="%4."/>
-      <w:lvlJc w:val="left"/>
-      <w:pPr>
-        <w:ind w:left="2880" w:hanging="360"/>
-      </w:pPr>
-      <w:rPr>
-        <w:u w:val="none"/>
-      </w:rPr>
-    </w:lvl>
-    <w:lvl w:ilvl="4">
-      <w:start w:val="1"/>
-      <w:numFmt w:val="lowerLetter"/>
-      <w:lvlText w:val="%5."/>
-      <w:lvlJc w:val="left"/>
-      <w:pPr>
-        <w:ind w:left="3600" w:hanging="360"/>
-      </w:pPr>
-      <w:rPr>
-        <w:u w:val="none"/>
-      </w:rPr>
-    </w:lvl>
-    <w:lvl w:ilvl="5">
-      <w:start w:val="1"/>
-      <w:numFmt w:val="lowerRoman"/>
-      <w:lvlText w:val="%6."/>
-      <w:lvlJc w:val="right"/>
-      <w:pPr>
-        <w:ind w:left="4320" w:hanging="360"/>
-      </w:pPr>
-      <w:rPr>
-        <w:u w:val="none"/>
-      </w:rPr>
-    </w:lvl>
-    <w:lvl w:ilvl="6">
-      <w:start w:val="1"/>
-      <w:numFmt w:val="decimal"/>
-      <w:lvlText w:val="%7."/>
-      <w:lvlJc w:val="left"/>
-      <w:pPr>
-        <w:ind w:left="5040" w:hanging="360"/>
-      </w:pPr>
-      <w:rPr>
-        <w:u w:val="none"/>
-      </w:rPr>
-    </w:lvl>
-    <w:lvl w:ilvl="7">
-      <w:start w:val="1"/>
-      <w:numFmt w:val="lowerLetter"/>
-      <w:lvlText w:val="%8."/>
-      <w:lvlJc w:val="left"/>
-      <w:pPr>
-        <w:ind w:left="5760" w:hanging="360"/>
-      </w:pPr>
-      <w:rPr>
-        <w:u w:val="none"/>
-      </w:rPr>
-    </w:lvl>
-    <w:lvl w:ilvl="8">
-      <w:start w:val="1"/>
-      <w:numFmt w:val="lowerRoman"/>
-      <w:lvlText w:val="%9."/>
-      <w:lvlJc w:val="right"/>
-      <w:pPr>
-        <w:ind w:left="6480" w:hanging="360"/>
-      </w:pPr>
-      <w:rPr>
-        <w:u w:val="none"/>
-      </w:rPr>
-    </w:lvl>
-  </w:abstractNum>
-  <w:num w:numId="1" w16cid:durableId="644822047">
+  <w:num w:numId="1" w16cid:durableId="36242068">
+    <w:abstractNumId w:val="3"/>
+  </w:num>
+  <w:num w:numId="2" w16cid:durableId="2133740120">
+    <w:abstractNumId w:val="6"/>
+  </w:num>
+  <w:num w:numId="3" w16cid:durableId="616255677">
+    <w:abstractNumId w:val="2"/>
+  </w:num>
+  <w:num w:numId="4" w16cid:durableId="413555465">
+    <w:abstractNumId w:val="4"/>
+  </w:num>
+  <w:num w:numId="5" w16cid:durableId="1494836171">
+    <w:abstractNumId w:val="0"/>
+  </w:num>
+  <w:num w:numId="6" w16cid:durableId="704981511">
+    <w:abstractNumId w:val="16"/>
+  </w:num>
+  <w:num w:numId="7" w16cid:durableId="226847898">
+    <w:abstractNumId w:val="7"/>
+  </w:num>
+  <w:num w:numId="8" w16cid:durableId="1003437442">
+    <w:abstractNumId w:val="14"/>
+  </w:num>
+  <w:num w:numId="9" w16cid:durableId="2104374649">
     <w:abstractNumId w:val="13"/>
   </w:num>
-  <w:num w:numId="2" w16cid:durableId="475344697">
+  <w:num w:numId="10" w16cid:durableId="1404600114">
+    <w:abstractNumId w:val="12"/>
+  </w:num>
+  <w:num w:numId="11" w16cid:durableId="923152473">
+    <w:abstractNumId w:val="1"/>
+  </w:num>
+  <w:num w:numId="12" w16cid:durableId="923296505">
+    <w:abstractNumId w:val="15"/>
+  </w:num>
+  <w:num w:numId="13" w16cid:durableId="1144463977">
+    <w:abstractNumId w:val="17"/>
+  </w:num>
+  <w:num w:numId="14" w16cid:durableId="919867639">
     <w:abstractNumId w:val="9"/>
   </w:num>
-  <w:num w:numId="3" w16cid:durableId="343560397">
-    <w:abstractNumId w:val="14"/>
-  </w:num>
-  <w:num w:numId="4" w16cid:durableId="1173377118">
+  <w:num w:numId="15" w16cid:durableId="463306019">
     <w:abstractNumId w:val="8"/>
   </w:num>
-  <w:num w:numId="5" w16cid:durableId="1680698925">
-    <w:abstractNumId w:val="2"/>
+  <w:num w:numId="16" w16cid:durableId="827018937">
+    <w:abstractNumId w:val="18"/>
   </w:num>
-  <w:num w:numId="6" w16cid:durableId="474106964">
-    <w:abstractNumId w:val="16"/>
-  </w:num>
-  <w:num w:numId="7" w16cid:durableId="1052577340">
+  <w:num w:numId="17" w16cid:durableId="1735932599">
     <w:abstractNumId w:val="10"/>
   </w:num>
-  <w:num w:numId="8" w16cid:durableId="386615128">
-    <w:abstractNumId w:val="12"/>
-  </w:num>
-  <w:num w:numId="9" w16cid:durableId="283116372">
-    <w:abstractNumId w:val="4"/>
-  </w:num>
-  <w:num w:numId="10" w16cid:durableId="1090081102">
-    <w:abstractNumId w:val="1"/>
-  </w:num>
-  <w:num w:numId="11" w16cid:durableId="1383557612">
-    <w:abstractNumId w:val="0"/>
-  </w:num>
-  <w:num w:numId="12" w16cid:durableId="365177231">
+  <w:num w:numId="18" w16cid:durableId="322776550">
     <w:abstractNumId w:val="5"/>
   </w:num>
-  <w:num w:numId="13" w16cid:durableId="181361294">
+  <w:num w:numId="19" w16cid:durableId="149030093">
     <w:abstractNumId w:val="11"/>
-  </w:num>
-  <w:num w:numId="14" w16cid:durableId="1248925608">
-    <w:abstractNumId w:val="17"/>
-  </w:num>
-  <w:num w:numId="15" w16cid:durableId="1456866736">
-    <w:abstractNumId w:val="15"/>
-  </w:num>
-  <w:num w:numId="16" w16cid:durableId="1240822411">
-    <w:abstractNumId w:val="3"/>
-  </w:num>
-  <w:num w:numId="17" w16cid:durableId="1972973390">
-    <w:abstractNumId w:val="6"/>
-  </w:num>
-  <w:num w:numId="18" w16cid:durableId="1194420392">
-    <w:abstractNumId w:val="18"/>
-  </w:num>
-  <w:num w:numId="19" w16cid:durableId="418253858">
-    <w:abstractNumId w:val="7"/>
   </w:num>
 </w:numbering>
 </file>
@@ -9778,7 +9835,7 @@
     <w:autoRedefine/>
     <w:uiPriority w:val="39"/>
     <w:unhideWhenUsed/>
-    <w:rsid w:val="00492221"/>
+    <w:rsid w:val="00C231F5"/>
     <w:pPr>
       <w:spacing w:after="100"/>
     </w:pPr>
@@ -9790,7 +9847,7 @@
     <w:autoRedefine/>
     <w:uiPriority w:val="39"/>
     <w:unhideWhenUsed/>
-    <w:rsid w:val="00492221"/>
+    <w:rsid w:val="00C231F5"/>
     <w:pPr>
       <w:spacing w:after="100"/>
       <w:ind w:left="200"/>
@@ -9801,7 +9858,7 @@
     <w:basedOn w:val="DefaultParagraphFont"/>
     <w:uiPriority w:val="99"/>
     <w:unhideWhenUsed/>
-    <w:rsid w:val="00492221"/>
+    <w:rsid w:val="00C231F5"/>
     <w:rPr>
       <w:color w:val="0000FF" w:themeColor="hyperlink"/>
       <w:u w:val="single"/>

</xml_diff>